<commit_message>
Centre the plan on the feature and drop the press release
The opening date now motivates the feature rather than a press release.
The press-release template becomes an Instagram caption for young
Örebro locals, the separate optional caption is removed, and every
mention across the plan, guides, checklist, README and build script is
updated to match.

Co-Authored-By: Claude Opus 5.5 <noreply@anthropic.com>
Claude-Session: https://claude.ai/code/session_018MUZWYbwBKJGQrLkujpwGT
</commit_message>
<xml_diff>
--- a/place-branding/08_Plan_and_Questions_for_Lecturer.docx
+++ b/place-branding/08_Plan_and_Questions_for_Lecturer.docx
@@ -382,7 +382,7 @@
         <w:t xml:space="preserve"> </w:t>
       </w:r>
       <w:r>
-        <w:t xml:space="preserve">It opened on 1 October 2026. That gives the press release a real news angle and gives the feature a moment of change to build on.</w:t>
+        <w:t xml:space="preserve">It opened on 1 October 2026, so the feature can catch the family at the very start, while everything is still a first: the first guests, the first regulars, the first hard weeks.</w:t>
       </w:r>
     </w:p>
     <w:p>
@@ -770,6 +770,14 @@
       </w:pPr>
       <w:r>
         <w:t xml:space="preserve">5. Who I am writing for</w:t>
+      </w:r>
+    </w:p>
+    <w:p>
+      <w:pPr>
+        <w:pStyle w:val="FirstParagraph"/>
+      </w:pPr>
+      <w:r>
+        <w:t xml:space="preserve">The feature is the heart of the project. The brief also asks for at least three shorter texts for other audiences, built from the same research.</w:t>
       </w:r>
     </w:p>
     <w:tbl>
@@ -897,43 +905,43 @@
               <w:jc w:val="left"/>
             </w:pPr>
             <w:r>
-              <w:t xml:space="preserve">Press release</w:t>
-            </w:r>
-          </w:p>
-        </w:tc>
-        <w:tc>
-          <w:tcPr/>
-          <w:p>
-            <w:pPr>
-              <w:pStyle w:val="Compact"/>
-              <w:jc w:val="left"/>
-            </w:pPr>
-            <w:r>
-              <w:t xml:space="preserve">Local journalists at Nerikes Allehanda, Sveriges Radio P4 Örebro and SVT Örebro</w:t>
-            </w:r>
-          </w:p>
-        </w:tc>
-        <w:tc>
-          <w:tcPr/>
-          <w:p>
-            <w:pPr>
-              <w:pStyle w:val="Compact"/>
-              <w:jc w:val="left"/>
-            </w:pPr>
-            <w:r>
-              <w:t xml:space="preserve">The news, key facts, a quotable source and a contact</w:t>
-            </w:r>
-          </w:p>
-        </w:tc>
-        <w:tc>
-          <w:tcPr/>
-          <w:p>
-            <w:pPr>
-              <w:pStyle w:val="Compact"/>
-              <w:jc w:val="left"/>
-            </w:pPr>
-            <w:r>
-              <w:t xml:space="preserve">Email to news desks</w:t>
+              <w:t xml:space="preserve">Practical webpage</w:t>
+            </w:r>
+          </w:p>
+        </w:tc>
+        <w:tc>
+          <w:tcPr/>
+          <w:p>
+            <w:pPr>
+              <w:pStyle w:val="Compact"/>
+              <w:jc w:val="left"/>
+            </w:pPr>
+            <w:r>
+              <w:t xml:space="preserve">Residents of [[AREA]] who have not visited yet</w:t>
+            </w:r>
+          </w:p>
+        </w:tc>
+        <w:tc>
+          <w:tcPr/>
+          <w:p>
+            <w:pPr>
+              <w:pStyle w:val="Compact"/>
+              <w:jc w:val="left"/>
+            </w:pPr>
+            <w:r>
+              <w:t xml:space="preserve">What it is, where, when, what it costs, what to expect</w:t>
+            </w:r>
+          </w:p>
+        </w:tc>
+        <w:tc>
+          <w:tcPr/>
+          <w:p>
+            <w:pPr>
+              <w:pStyle w:val="Compact"/>
+              <w:jc w:val="left"/>
+            </w:pPr>
+            <w:r>
+              <w:t xml:space="preserve">Restaurant’s website or a local guide page</w:t>
             </w:r>
           </w:p>
         </w:tc>
@@ -947,43 +955,43 @@
               <w:jc w:val="left"/>
             </w:pPr>
             <w:r>
-              <w:t xml:space="preserve">Practical webpage</w:t>
-            </w:r>
-          </w:p>
-        </w:tc>
-        <w:tc>
-          <w:tcPr/>
-          <w:p>
-            <w:pPr>
-              <w:pStyle w:val="Compact"/>
-              <w:jc w:val="left"/>
-            </w:pPr>
-            <w:r>
-              <w:t xml:space="preserve">Residents of [[AREA]] who have not visited yet</w:t>
-            </w:r>
-          </w:p>
-        </w:tc>
-        <w:tc>
-          <w:tcPr/>
-          <w:p>
-            <w:pPr>
-              <w:pStyle w:val="Compact"/>
-              <w:jc w:val="left"/>
-            </w:pPr>
-            <w:r>
-              <w:t xml:space="preserve">What it is, where, when, what it costs, what to expect</w:t>
-            </w:r>
-          </w:p>
-        </w:tc>
-        <w:tc>
-          <w:tcPr/>
-          <w:p>
-            <w:pPr>
-              <w:pStyle w:val="Compact"/>
-              <w:jc w:val="left"/>
-            </w:pPr>
-            <w:r>
-              <w:t xml:space="preserve">Restaurant’s website or a local guide page</w:t>
+              <w:t xml:space="preserve">LinkedIn text</w:t>
+            </w:r>
+          </w:p>
+        </w:tc>
+        <w:tc>
+          <w:tcPr/>
+          <w:p>
+            <w:pPr>
+              <w:pStyle w:val="Compact"/>
+              <w:jc w:val="left"/>
+            </w:pPr>
+            <w:r>
+              <w:t xml:space="preserve">Local partners: student associations, local food producers and nearby businesses</w:t>
+            </w:r>
+          </w:p>
+        </w:tc>
+        <w:tc>
+          <w:tcPr/>
+          <w:p>
+            <w:pPr>
+              <w:pStyle w:val="Compact"/>
+              <w:jc w:val="left"/>
+            </w:pPr>
+            <w:r>
+              <w:t xml:space="preserve">What they gain from working with the restaurant, and one clear next step</w:t>
+            </w:r>
+          </w:p>
+        </w:tc>
+        <w:tc>
+          <w:tcPr/>
+          <w:p>
+            <w:pPr>
+              <w:pStyle w:val="Compact"/>
+              <w:jc w:val="left"/>
+            </w:pPr>
+            <w:r>
+              <w:t xml:space="preserve">LinkedIn</w:t>
             </w:r>
           </w:p>
         </w:tc>
@@ -997,43 +1005,43 @@
               <w:jc w:val="left"/>
             </w:pPr>
             <w:r>
-              <w:t xml:space="preserve">LinkedIn text</w:t>
-            </w:r>
-          </w:p>
-        </w:tc>
-        <w:tc>
-          <w:tcPr/>
-          <w:p>
-            <w:pPr>
-              <w:pStyle w:val="Compact"/>
-              <w:jc w:val="left"/>
-            </w:pPr>
-            <w:r>
-              <w:t xml:space="preserve">Local partners: student associations, local food producers and nearby businesses</w:t>
-            </w:r>
-          </w:p>
-        </w:tc>
-        <w:tc>
-          <w:tcPr/>
-          <w:p>
-            <w:pPr>
-              <w:pStyle w:val="Compact"/>
-              <w:jc w:val="left"/>
-            </w:pPr>
-            <w:r>
-              <w:t xml:space="preserve">What they gain from working with the restaurant, and one clear next step</w:t>
-            </w:r>
-          </w:p>
-        </w:tc>
-        <w:tc>
-          <w:tcPr/>
-          <w:p>
-            <w:pPr>
-              <w:pStyle w:val="Compact"/>
-              <w:jc w:val="left"/>
-            </w:pPr>
-            <w:r>
-              <w:t xml:space="preserve">LinkedIn</w:t>
+              <w:t xml:space="preserve">Instagram caption</w:t>
+            </w:r>
+          </w:p>
+        </w:tc>
+        <w:tc>
+          <w:tcPr/>
+          <w:p>
+            <w:pPr>
+              <w:pStyle w:val="Compact"/>
+              <w:jc w:val="left"/>
+            </w:pPr>
+            <w:r>
+              <w:t xml:space="preserve">Young Örebro locals, roughly 18 to 30, who choose where to eat from social media</w:t>
+            </w:r>
+          </w:p>
+        </w:tc>
+        <w:tc>
+          <w:tcPr/>
+          <w:p>
+            <w:pPr>
+              <w:pStyle w:val="Compact"/>
+              <w:jc w:val="left"/>
+            </w:pPr>
+            <w:r>
+              <w:t xml:space="preserve">A reason to go now, in one image and a few lines</w:t>
+            </w:r>
+          </w:p>
+        </w:tc>
+        <w:tc>
+          <w:tcPr/>
+          <w:p>
+            <w:pPr>
+              <w:pStyle w:val="Compact"/>
+              <w:jc w:val="left"/>
+            </w:pPr>
+            <w:r>
+              <w:t xml:space="preserve">Instagram</w:t>
             </w:r>
           </w:p>
         </w:tc>
@@ -1408,7 +1416,7 @@
               <w:jc w:val="left"/>
             </w:pPr>
             <w:r>
-              <w:t xml:space="preserve">The central story of the feature, and quotations for the press release and LinkedIn text</w:t>
+              <w:t xml:space="preserve">The central story and main quotations of the feature</w:t>
             </w:r>
           </w:p>
         </w:tc>

</xml_diff>

<commit_message>
Switch the three short texts to Instagram, Facebook and LinkedIn
Per the lecturer's guidance, the feature is the main piece and the other
three texts are short social posts that reuse its core message and one
photograph. Replace the caption, webpage and LinkedIn templates with one
file holding the shared message, photo crop notes, a comparison table and
the three posts. Justify each platform with Internetstiftelsen's 2025
usage figures by generation, add them to the research notes, source log
and references, and add an owner question on local partners for the
LinkedIn post.

Co-Authored-By: Claude Opus 5.5 <noreply@anthropic.com>
Claude-Session: https://claude.ai/code/session_018MUZWYbwBKJGQrLkujpwGT
</commit_message>
<xml_diff>
--- a/place-branding/08_Plan_and_Questions_for_Lecturer.docx
+++ b/place-branding/08_Plan_and_Questions_for_Lecturer.docx
@@ -777,7 +777,7 @@
         <w:pStyle w:val="FirstParagraph"/>
       </w:pPr>
       <w:r>
-        <w:t xml:space="preserve">The feature is the heart of the project. The brief also asks for at least three shorter texts for other audiences, built from the same research.</w:t>
+        <w:t xml:space="preserve">The feature is the main piece. I will then reuse its core message and one photograph from my visit in three short social media posts, each adapted to a different audience. I chose the platforms from Swedish usage data rather than my own habits, because the same platform can mean very different things in different countries.</w:t>
       </w:r>
     </w:p>
     <w:tbl>
@@ -829,19 +829,19 @@
               <w:jc w:val="left"/>
             </w:pPr>
             <w:r>
-              <w:t xml:space="preserve">What they need</w:t>
-            </w:r>
-          </w:p>
-        </w:tc>
-        <w:tc>
-          <w:tcPr/>
-          <w:p>
-            <w:pPr>
-              <w:pStyle w:val="Compact"/>
-              <w:jc w:val="left"/>
-            </w:pPr>
-            <w:r>
-              <w:t xml:space="preserve">Platform</w:t>
+              <w:t xml:space="preserve">Why this platform</w:t>
+            </w:r>
+          </w:p>
+        </w:tc>
+        <w:tc>
+          <w:tcPr/>
+          <w:p>
+            <w:pPr>
+              <w:pStyle w:val="Compact"/>
+              <w:jc w:val="left"/>
+            </w:pPr>
+            <w:r>
+              <w:t xml:space="preserve">Format</w:t>
             </w:r>
           </w:p>
         </w:tc>
@@ -855,7 +855,7 @@
               <w:jc w:val="left"/>
             </w:pPr>
             <w:r>
-              <w:t xml:space="preserve">Feature (interview-based)</w:t>
+              <w:t xml:space="preserve">Feature</w:t>
             </w:r>
           </w:p>
         </w:tc>
@@ -879,19 +879,19 @@
               <w:jc w:val="left"/>
             </w:pPr>
             <w:r>
-              <w:t xml:space="preserve">A human way into the city, practical reassurance, and an honest picture</w:t>
-            </w:r>
-          </w:p>
-        </w:tc>
-        <w:tc>
-          <w:tcPr/>
-          <w:p>
-            <w:pPr>
-              <w:pStyle w:val="Compact"/>
-              <w:jc w:val="left"/>
-            </w:pPr>
-            <w:r>
-              <w:t xml:space="preserve">Student magazine or Örebro University news site</w:t>
+              <w:t xml:space="preserve">The main story, read in full</w:t>
+            </w:r>
+          </w:p>
+        </w:tc>
+        <w:tc>
+          <w:tcPr/>
+          <w:p>
+            <w:pPr>
+              <w:pStyle w:val="Compact"/>
+              <w:jc w:val="left"/>
+            </w:pPr>
+            <w:r>
+              <w:t xml:space="preserve">900 to 1,200 words, for a student magazine or the Örebro University news site</w:t>
             </w:r>
           </w:p>
         </w:tc>
@@ -905,43 +905,43 @@
               <w:jc w:val="left"/>
             </w:pPr>
             <w:r>
-              <w:t xml:space="preserve">Practical webpage</w:t>
-            </w:r>
-          </w:p>
-        </w:tc>
-        <w:tc>
-          <w:tcPr/>
-          <w:p>
-            <w:pPr>
-              <w:pStyle w:val="Compact"/>
-              <w:jc w:val="left"/>
-            </w:pPr>
-            <w:r>
-              <w:t xml:space="preserve">Residents of [[AREA]] who have not visited yet</w:t>
-            </w:r>
-          </w:p>
-        </w:tc>
-        <w:tc>
-          <w:tcPr/>
-          <w:p>
-            <w:pPr>
-              <w:pStyle w:val="Compact"/>
-              <w:jc w:val="left"/>
-            </w:pPr>
-            <w:r>
-              <w:t xml:space="preserve">What it is, where, when, what it costs, what to expect</w:t>
-            </w:r>
-          </w:p>
-        </w:tc>
-        <w:tc>
-          <w:tcPr/>
-          <w:p>
-            <w:pPr>
-              <w:pStyle w:val="Compact"/>
-              <w:jc w:val="left"/>
-            </w:pPr>
-            <w:r>
-              <w:t xml:space="preserve">Restaurant’s website or a local guide page</w:t>
+              <w:t xml:space="preserve">Instagram</w:t>
+            </w:r>
+          </w:p>
+        </w:tc>
+        <w:tc>
+          <w:tcPr/>
+          <w:p>
+            <w:pPr>
+              <w:pStyle w:val="Compact"/>
+              <w:jc w:val="left"/>
+            </w:pPr>
+            <w:r>
+              <w:t xml:space="preserve">Gen Z and younger millennials in Örebro, roughly 18 to 35</w:t>
+            </w:r>
+          </w:p>
+        </w:tc>
+        <w:tc>
+          <w:tcPr/>
+          <w:p>
+            <w:pPr>
+              <w:pStyle w:val="Compact"/>
+              <w:jc w:val="left"/>
+            </w:pPr>
+            <w:r>
+              <w:t xml:space="preserve">69% of Swedes born in the 1990s and 65% born in the 2000s use Instagram daily (Internetstiftelsen, 2025)</w:t>
+            </w:r>
+          </w:p>
+        </w:tc>
+        <w:tc>
+          <w:tcPr/>
+          <w:p>
+            <w:pPr>
+              <w:pStyle w:val="Compact"/>
+              <w:jc w:val="left"/>
+            </w:pPr>
+            <w:r>
+              <w:t xml:space="preserve">The photo first, a short caption and a few hashtags</w:t>
             </w:r>
           </w:p>
         </w:tc>
@@ -955,43 +955,61 @@
               <w:jc w:val="left"/>
             </w:pPr>
             <w:r>
-              <w:t xml:space="preserve">LinkedIn text</w:t>
-            </w:r>
-          </w:p>
-        </w:tc>
-        <w:tc>
-          <w:tcPr/>
-          <w:p>
-            <w:pPr>
-              <w:pStyle w:val="Compact"/>
-              <w:jc w:val="left"/>
-            </w:pPr>
-            <w:r>
-              <w:t xml:space="preserve">Local partners: student associations, local food producers and nearby businesses</w:t>
-            </w:r>
-          </w:p>
-        </w:tc>
-        <w:tc>
-          <w:tcPr/>
-          <w:p>
-            <w:pPr>
-              <w:pStyle w:val="Compact"/>
-              <w:jc w:val="left"/>
-            </w:pPr>
-            <w:r>
-              <w:t xml:space="preserve">What they gain from working with the restaurant, and one clear next step</w:t>
-            </w:r>
-          </w:p>
-        </w:tc>
-        <w:tc>
-          <w:tcPr/>
-          <w:p>
-            <w:pPr>
-              <w:pStyle w:val="Compact"/>
-              <w:jc w:val="left"/>
-            </w:pPr>
-            <w:r>
-              <w:t xml:space="preserve">LinkedIn</w:t>
+              <w:t xml:space="preserve">Facebook</w:t>
+            </w:r>
+          </w:p>
+        </w:tc>
+        <w:tc>
+          <w:tcPr/>
+          <w:p>
+            <w:pPr>
+              <w:pStyle w:val="Compact"/>
+              <w:jc w:val="left"/>
+            </w:pPr>
+            <w:r>
+              <w:t xml:space="preserve">Örebro residents roughly 35 to 65, including families and neighbours</w:t>
+            </w:r>
+          </w:p>
+        </w:tc>
+        <w:tc>
+          <w:tcPr/>
+          <w:p>
+            <w:pPr>
+              <w:pStyle w:val="Compact"/>
+              <w:jc w:val="left"/>
+            </w:pPr>
+            <w:r>
+              <w:t xml:space="preserve">In Sweden Facebook</w:t>
+            </w:r>
+            <w:r>
+              <w:t xml:space="preserve"> </w:t>
+            </w:r>
+            <w:r>
+              <w:t xml:space="preserve">“</w:t>
+            </w:r>
+            <w:r>
+              <w:t xml:space="preserve">dominates among older</w:t>
+            </w:r>
+            <w:r>
+              <w:t xml:space="preserve">”</w:t>
+            </w:r>
+            <w:r>
+              <w:t xml:space="preserve"> </w:t>
+            </w:r>
+            <w:r>
+              <w:t xml:space="preserve">users: 62 to 64% of those born in the 1950s to 1980s use it daily, against 25% of those born in the 2000s (Internetstiftelsen, 2025)</w:t>
+            </w:r>
+          </w:p>
+        </w:tc>
+        <w:tc>
+          <w:tcPr/>
+          <w:p>
+            <w:pPr>
+              <w:pStyle w:val="Compact"/>
+              <w:jc w:val="left"/>
+            </w:pPr>
+            <w:r>
+              <w:t xml:space="preserve">The same photo, a longer neighbourly post with practical details and a link to the feature</w:t>
             </w:r>
           </w:p>
         </w:tc>
@@ -1005,43 +1023,43 @@
               <w:jc w:val="left"/>
             </w:pPr>
             <w:r>
-              <w:t xml:space="preserve">Instagram caption</w:t>
-            </w:r>
-          </w:p>
-        </w:tc>
-        <w:tc>
-          <w:tcPr/>
-          <w:p>
-            <w:pPr>
-              <w:pStyle w:val="Compact"/>
-              <w:jc w:val="left"/>
-            </w:pPr>
-            <w:r>
-              <w:t xml:space="preserve">Young Örebro locals, roughly 18 to 30, who choose where to eat from social media</w:t>
-            </w:r>
-          </w:p>
-        </w:tc>
-        <w:tc>
-          <w:tcPr/>
-          <w:p>
-            <w:pPr>
-              <w:pStyle w:val="Compact"/>
-              <w:jc w:val="left"/>
-            </w:pPr>
-            <w:r>
-              <w:t xml:space="preserve">A reason to go now, in one image and a few lines</w:t>
-            </w:r>
-          </w:p>
-        </w:tc>
-        <w:tc>
-          <w:tcPr/>
-          <w:p>
-            <w:pPr>
-              <w:pStyle w:val="Compact"/>
-              <w:jc w:val="left"/>
-            </w:pPr>
-            <w:r>
-              <w:t xml:space="preserve">Instagram</w:t>
+              <w:t xml:space="preserve">LinkedIn</w:t>
+            </w:r>
+          </w:p>
+        </w:tc>
+        <w:tc>
+          <w:tcPr/>
+          <w:p>
+            <w:pPr>
+              <w:pStyle w:val="Compact"/>
+              <w:jc w:val="left"/>
+            </w:pPr>
+            <w:r>
+              <w:t xml:space="preserve">Local professionals and potential partners: business networks, food producers, student associations</w:t>
+            </w:r>
+          </w:p>
+        </w:tc>
+        <w:tc>
+          <w:tcPr/>
+          <w:p>
+            <w:pPr>
+              <w:pStyle w:val="Compact"/>
+              <w:jc w:val="left"/>
+            </w:pPr>
+            <w:r>
+              <w:t xml:space="preserve">42% of Swedes born in the 1970s to 1990s used LinkedIn in the past year (Internetstiftelsen, 2025)</w:t>
+            </w:r>
+          </w:p>
+        </w:tc>
+        <w:tc>
+          <w:tcPr/>
+          <w:p>
+            <w:pPr>
+              <w:pStyle w:val="Compact"/>
+              <w:jc w:val="left"/>
+            </w:pPr>
+            <w:r>
+              <w:t xml:space="preserve">The same photo, a professional post on starting a business in Örebro, with one statistic, one quotation and one call to action</w:t>
             </w:r>
           </w:p>
         </w:tc>
@@ -1830,6 +1848,18 @@
       </w:pPr>
       <w:r>
         <w:t xml:space="preserve">Where do you see the restaurant one year from now? (RQ6)</w:t>
+      </w:r>
+    </w:p>
+    <w:p>
+      <w:pPr>
+        <w:numPr>
+          <w:ilvl w:val="0"/>
+          <w:numId w:val="1004"/>
+        </w:numPr>
+        <w:pStyle w:val="Compact"/>
+      </w:pPr>
+      <w:r>
+        <w:t xml:space="preserve">Are there local businesses, food producers or groups you would like to work with? (RQ5)</w:t>
       </w:r>
     </w:p>
     <w:p>
@@ -2312,7 +2342,7 @@
               <w:jc w:val="left"/>
             </w:pPr>
             <w:r>
-              <w:t xml:space="preserve">3, 11, 13</w:t>
+              <w:t xml:space="preserve">3, 11, 13, 19</w:t>
             </w:r>
           </w:p>
         </w:tc>
@@ -2777,6 +2807,30 @@
       </w:r>
       <w:r>
         <w:t xml:space="preserve">[Regional statistics]. https://www.ekonomifakta.se/Fakta/Regional-statistik/Alla-lan/Orebro-lan/Orebro/</w:t>
+      </w:r>
+    </w:p>
+    <w:p>
+      <w:pPr>
+        <w:pStyle w:val="BodyText"/>
+      </w:pPr>
+      <w:r>
+        <w:t xml:space="preserve">Internetstiftelsen. (2025).</w:t>
+      </w:r>
+      <w:r>
+        <w:t xml:space="preserve"> </w:t>
+      </w:r>
+      <w:r>
+        <w:rPr>
+          <w:iCs/>
+          <w:i/>
+        </w:rPr>
+        <w:t xml:space="preserve">Svenskarna och internet 2025</w:t>
+      </w:r>
+      <w:r>
+        <w:t xml:space="preserve"> </w:t>
+      </w:r>
+      <w:r>
+        <w:t xml:space="preserve">[The Swedes and the internet 2025]. https://svenskarnaochinternet.se/app/uploads/2025/09/internetstiftelsen-svenskarna-och-internet-2025.pdf</w:t>
       </w:r>
     </w:p>
     <w:p>

</xml_diff>

<commit_message>
Apply lecturer feedback of 15 October and fix the author name
Use the student's correct name, Ayodele Adeleye, throughout, and fill in
Tomasii Restaurang at Karlsdalsallén 63. Reframe the lens as a
proposition to investigate, add the lecturer's three concrete-moment
questions to the owner list and Hannah's bilingual sheet, prioritise the
owners, one customer and one nearby business owner, and give each post a
specific audience and purpose. Replace the communication plan with the
requested theoretical brief, set the feature to 800 to 1,200 words for
The Local Sweden, and add translation guidance. Verify the bankruptcy,
business-climate and slogan facts against their original sources, record
their scope, and correct the unconfirmed "record bankruptcies" claim.

Co-Authored-By: Claude Opus 5.5 <noreply@anthropic.com>
Claude-Session: https://claude.ai/code/session_018MUZWYbwBKJGQrLkujpwGT
</commit_message>
<xml_diff>
--- a/place-branding/08_Plan_and_Questions_for_Lecturer.docx
+++ b/place-branding/08_Plan_and_Questions_for_Lecturer.docx
@@ -25,6 +25,12 @@
         <w:t xml:space="preserve"> </w:t>
       </w:r>
       <w:r>
+        <w:t xml:space="preserve">Working</w:t>
+      </w:r>
+      <w:r>
+        <w:t xml:space="preserve"> </w:t>
+      </w:r>
+      <w:r>
         <w:t xml:space="preserve">Plan</w:t>
       </w:r>
       <w:r>
@@ -51,16 +57,19 @@
         <w:pStyle w:val="Subtitle"/>
       </w:pPr>
       <w:r>
-        <w:t xml:space="preserve">Örebro,</w:t>
-      </w:r>
-      <w:r>
-        <w:t xml:space="preserve"> </w:t>
-      </w:r>
-      <w:r>
-        <w:t xml:space="preserve">the</w:t>
-      </w:r>
-      <w:r>
-        <w:t xml:space="preserve"> </w:t>
+        <w:t xml:space="preserve">Testing</w:t>
+      </w:r>
+      <w:r>
+        <w:t xml:space="preserve"> </w:t>
+      </w:r>
+      <w:r>
+        <w:t xml:space="preserve">Örebro’s</w:t>
+      </w:r>
+      <w:r>
+        <w:t xml:space="preserve"> </w:t>
+      </w:r>
+      <w:r>
+        <w:t xml:space="preserve">“</w:t>
       </w:r>
       <w:r>
         <w:t xml:space="preserve">place</w:t>
@@ -75,13 +84,10 @@
         <w:t xml:space="preserve"> </w:t>
       </w:r>
       <w:r>
-        <w:t xml:space="preserve">opportunities,</w:t>
-      </w:r>
-      <w:r>
-        <w:t xml:space="preserve"> </w:t>
-      </w:r>
-      <w:r>
-        <w:t xml:space="preserve">seen</w:t>
+        <w:t xml:space="preserve">opportunities</w:t>
+      </w:r>
+      <w:r>
+        <w:t xml:space="preserve">”</w:t>
       </w:r>
       <w:r>
         <w:t xml:space="preserve"> </w:t>
@@ -119,13 +125,13 @@
         <w:pStyle w:val="Author"/>
       </w:pPr>
       <w:r>
-        <w:t xml:space="preserve">David</w:t>
-      </w:r>
-      <w:r>
-        <w:t xml:space="preserve"> </w:t>
-      </w:r>
-      <w:r>
-        <w:t xml:space="preserve">Ezieshi</w:t>
+        <w:t xml:space="preserve">Ayodele</w:t>
+      </w:r>
+      <w:r>
+        <w:t xml:space="preserve"> </w:t>
+      </w:r>
+      <w:r>
+        <w:t xml:space="preserve">Adeleye</w:t>
       </w:r>
       <w:r>
         <w:t xml:space="preserve"> </w:t>
@@ -157,17 +163,49 @@
       <w:r>
         <w:t xml:space="preserve">I</w:t>
       </w:r>
-      <w:r>
-        <w:t xml:space="preserve"> </w:t>
-      </w:r>
-      <w:r>
-        <w:t xml:space="preserve">·</w:t>
-      </w:r>
-      <w:r>
-        <w:t xml:space="preserve"> </w:t>
-      </w:r>
-      <w:r>
-        <w:t xml:space="preserve">for</w:t>
+    </w:p>
+    <w:p>
+      <w:pPr>
+        <w:pStyle w:val="Date"/>
+      </w:pPr>
+      <w:r>
+        <w:t xml:space="preserve">Updated</w:t>
+      </w:r>
+      <w:r>
+        <w:t xml:space="preserve"> </w:t>
+      </w:r>
+      <w:r>
+        <w:t xml:space="preserve">15</w:t>
+      </w:r>
+      <w:r>
+        <w:t xml:space="preserve"> </w:t>
+      </w:r>
+      <w:r>
+        <w:t xml:space="preserve">October</w:t>
+      </w:r>
+      <w:r>
+        <w:t xml:space="preserve"> </w:t>
+      </w:r>
+      <w:r>
+        <w:t xml:space="preserve">2026</w:t>
+      </w:r>
+      <w:r>
+        <w:t xml:space="preserve"> </w:t>
+      </w:r>
+      <w:r>
+        <w:t xml:space="preserve">after</w:t>
+      </w:r>
+      <w:r>
+        <w:t xml:space="preserve"> </w:t>
+      </w:r>
+      <w:r>
+        <w:t xml:space="preserve">feedback</w:t>
+      </w:r>
+      <w:r>
+        <w:t xml:space="preserve"> </w:t>
+      </w:r>
+      <w:r>
+        <w:t xml:space="preserve">from</w:t>
       </w:r>
       <w:r>
         <w:t xml:space="preserve"> </w:t>
@@ -188,26 +226,6 @@
         <w:t xml:space="preserve">Gody</w:t>
       </w:r>
     </w:p>
-    <w:p>
-      <w:pPr>
-        <w:pStyle w:val="Date"/>
-      </w:pPr>
-      <w:r>
-        <w:t xml:space="preserve">15</w:t>
-      </w:r>
-      <w:r>
-        <w:t xml:space="preserve"> </w:t>
-      </w:r>
-      <w:r>
-        <w:t xml:space="preserve">October</w:t>
-      </w:r>
-      <w:r>
-        <w:t xml:space="preserve"> </w:t>
-      </w:r>
-      <w:r>
-        <w:t xml:space="preserve">2026</w:t>
-      </w:r>
-    </w:p>
     <w:bookmarkStart w:id="20" w:name="the-project-in-one-sentence"/>
     <w:p>
       <w:pPr>
@@ -222,17 +240,56 @@
         <w:pStyle w:val="FirstParagraph"/>
       </w:pPr>
       <w:r>
-        <w:t xml:space="preserve">I will promote Örebro as a place of opportunity, seen through [[RESTAURANT NAME]], a family-run restaurant that opened on 1 October 2026 on [[STREET]], in premises where another restaurant used to be.</w:t>
+        <w:t xml:space="preserve">I will explore the claim that the Örebro region is</w:t>
+      </w:r>
+      <w:r>
+        <w:t xml:space="preserve"> </w:t>
+      </w:r>
+      <w:r>
+        <w:t xml:space="preserve">“</w:t>
+      </w:r>
+      <w:r>
+        <w:t xml:space="preserve">the place of opportunities</w:t>
+      </w:r>
+      <w:r>
+        <w:t xml:space="preserve">”</w:t>
+      </w:r>
+      <w:r>
+        <w:t xml:space="preserve"> </w:t>
+      </w:r>
+      <w:r>
+        <w:t xml:space="preserve">through the first weeks of Tomasii Restaurang, a family-run restaurant at Karlsdalsallén 63 that opened on 1 October 2026 in premises where another restaurant used to be.</w:t>
       </w:r>
     </w:p>
     <w:bookmarkEnd w:id="20"/>
-    <w:bookmarkStart w:id="21" w:name="X71283f2a679f9d45faa3239a8cc41eb975c4195"/>
+    <w:bookmarkStart w:id="21" w:name="the-lens-a-proposition-to-investigate"/>
     <w:p>
       <w:pPr>
         <w:pStyle w:val="Heading2"/>
       </w:pPr>
       <w:r>
-        <w:t xml:space="preserve">2. The lens: Örebro as</w:t>
+        <w:t xml:space="preserve">2. The lens: a proposition to investigate</w:t>
+      </w:r>
+    </w:p>
+    <w:p>
+      <w:pPr>
+        <w:pStyle w:val="FirstParagraph"/>
+      </w:pPr>
+      <w:r>
+        <w:t xml:space="preserve">The phrase comes from Örebro’s regional place story,</w:t>
+      </w:r>
+      <w:r>
+        <w:t xml:space="preserve"> </w:t>
+      </w:r>
+      <w:r>
+        <w:rPr>
+          <w:iCs/>
+          <w:i/>
+        </w:rPr>
+        <w:t xml:space="preserve">Örebro platsberättelse</w:t>
+      </w:r>
+      <w:r>
+        <w:t xml:space="preserve">. It describes</w:t>
       </w:r>
       <w:r>
         <w:t xml:space="preserve"> </w:t>
@@ -241,18 +298,13 @@
         <w:t xml:space="preserve">“</w:t>
       </w:r>
       <w:r>
-        <w:t xml:space="preserve">the place of opportunities</w:t>
+        <w:t xml:space="preserve">The Greater Örebro Area</w:t>
       </w:r>
       <w:r>
         <w:t xml:space="preserve">”</w:t>
       </w:r>
-    </w:p>
-    <w:p>
-      <w:pPr>
-        <w:pStyle w:val="FirstParagraph"/>
-      </w:pPr>
-      <w:r>
-        <w:t xml:space="preserve">Örebro’s official place story describes the Greater Örebro Area as</w:t>
+      <w:r>
+        <w:t xml:space="preserve">, meaning the whole county, as</w:t>
       </w:r>
       <w:r>
         <w:t xml:space="preserve"> </w:t>
@@ -280,7 +332,7 @@
         <w:t xml:space="preserve">”</w:t>
       </w:r>
       <w:r>
-        <w:t xml:space="preserve">. It says that people</w:t>
+        <w:t xml:space="preserve">, and says that people</w:t>
       </w:r>
       <w:r>
         <w:t xml:space="preserve"> </w:t>
@@ -316,7 +368,25 @@
         <w:t xml:space="preserve"> </w:t>
       </w:r>
       <w:r>
-        <w:t xml:space="preserve">(Region Örebro län, 2024; my translation). The same story builds Örebro’s identity on food: local produce, pikeperch from Lake Hjälmaren, and restaurants that work with nearby farms.</w:t>
+        <w:t xml:space="preserve">(Region Örebro län, 2024; my translation). Region Örebro län developed it with the agency Placebrander as a story</w:t>
+      </w:r>
+      <w:r>
+        <w:t xml:space="preserve"> </w:t>
+      </w:r>
+      <w:r>
+        <w:t xml:space="preserve">“</w:t>
+      </w:r>
+      <w:r>
+        <w:t xml:space="preserve">for tourism and the visitor economy</w:t>
+      </w:r>
+      <w:r>
+        <w:t xml:space="preserve">”</w:t>
+      </w:r>
+      <w:r>
+        <w:t xml:space="preserve"> </w:t>
+      </w:r>
+      <w:r>
+        <w:t xml:space="preserve">(Region Örebro län, 2023).</w:t>
       </w:r>
     </w:p>
     <w:p>
@@ -324,25 +394,7 @@
         <w:pStyle w:val="BodyText"/>
       </w:pPr>
       <w:r>
-        <w:t xml:space="preserve">My lens tests that promise at street level. A family that has just opened a restaurant is living the</w:t>
-      </w:r>
-      <w:r>
-        <w:t xml:space="preserve"> </w:t>
-      </w:r>
-      <w:r>
-        <w:t xml:space="preserve">“</w:t>
-      </w:r>
-      <w:r>
-        <w:t xml:space="preserve">place of opportunities</w:t>
-      </w:r>
-      <w:r>
-        <w:t xml:space="preserve">”</w:t>
-      </w:r>
-      <w:r>
-        <w:t xml:space="preserve"> </w:t>
-      </w:r>
-      <w:r>
-        <w:t xml:space="preserve">story right now, including its risks. Through them I can show readers what Örebro offers someone who starts something new here, and be honest about what is hard.</w:t>
+        <w:t xml:space="preserve">I treat that phrase as a proposition to investigate, not a fact to promote. The family’s first weeks show what starting a business here feels like in practice: what made it possible, what helped, and what has been hard. One restaurant cannot represent the whole city, so the feature presents their experience as one honest case, alongside a customer’s and a nearby business owner’s view.</w:t>
       </w:r>
     </w:p>
     <w:p>
@@ -350,17 +402,17 @@
         <w:pStyle w:val="BodyText"/>
       </w:pPr>
       <w:r>
-        <w:t xml:space="preserve">In Kavaratzis’s (2004) terms, the place story is Örebro’s secondary communication, meaning what the city deliberately says about itself. The restaurant and its street are primary communication, meaning what the place actually is and does. Customers, neighbours and online reviews are tertiary communication, meaning what others say. My portfolio puts these three side by side.</w:t>
+        <w:t xml:space="preserve">In Kavaratzis’s (2004) terms, the place story is secondary communication: what the region deliberately says about itself. The restaurant and its street are primary communication: what the place actually is and does. Customers, neighbours and reviews are tertiary communication: what others say. The portfolio sets these side by side and asks where they agree and where they differ.</w:t>
       </w:r>
     </w:p>
     <w:bookmarkEnd w:id="21"/>
-    <w:bookmarkStart w:id="22" w:name="why-i-chose-this-restaurant"/>
+    <w:bookmarkStart w:id="22" w:name="why-this-restaurant"/>
     <w:p>
       <w:pPr>
         <w:pStyle w:val="Heading2"/>
       </w:pPr>
       <w:r>
-        <w:t xml:space="preserve">3. Why I chose this restaurant</w:t>
+        <w:t xml:space="preserve">3. Why this restaurant</w:t>
       </w:r>
     </w:p>
     <w:p>
@@ -382,7 +434,7 @@
         <w:t xml:space="preserve"> </w:t>
       </w:r>
       <w:r>
-        <w:t xml:space="preserve">It opened on 1 October 2026, so the feature can catch the family at the very start, while everything is still a first: the first guests, the first regulars, the first hard weeks.</w:t>
+        <w:t xml:space="preserve">It opened on 1 October 2026, so the feature can catch the family at the very start, while everything is still a first.</w:t>
       </w:r>
     </w:p>
     <w:p>
@@ -404,7 +456,7 @@
         <w:t xml:space="preserve"> </w:t>
       </w:r>
       <w:r>
-        <w:t xml:space="preserve">Another restaurant used to operate in the same premises. The new opening says something about how this street is changing.</w:t>
+        <w:t xml:space="preserve">Another restaurant used to operate in the same premises.</w:t>
       </w:r>
     </w:p>
     <w:p>
@@ -426,7 +478,7 @@
         <w:t xml:space="preserve"> </w:t>
       </w:r>
       <w:r>
-        <w:t xml:space="preserve">Hannah and her husband own and run it together, often with their children there. That gives the feature a human centre and fits the opportunity lens directly.</w:t>
+        <w:t xml:space="preserve">Hannah and her husband own and run it together, which gives the feature a human centre.</w:t>
       </w:r>
     </w:p>
     <w:p>
@@ -448,7 +500,7 @@
         <w:t xml:space="preserve"> </w:t>
       </w:r>
       <w:r>
-        <w:t xml:space="preserve">It is about ten minutes from where I live, so I can visit several times at different hours, observe, and check facts. The owners have agreed to an interview on Monday 19 October.</w:t>
+        <w:t xml:space="preserve">I can visit at different times of day to observe the restaurant and its street, and the owners have agreed to an interview on Monday 19 October.</w:t>
       </w:r>
     </w:p>
     <w:p>
@@ -464,13 +516,13 @@
           <w:bCs/>
           <w:b/>
         </w:rPr>
-        <w:t xml:space="preserve">It speaks to my readers.</w:t>
-      </w:r>
-      <w:r>
-        <w:t xml:space="preserve"> </w:t>
-      </w:r>
-      <w:r>
-        <w:t xml:space="preserve">I am an international student and fairly new to Örebro myself. A newcomer writing about newcomers who are building something here gives the feature an honest point of view.</w:t>
+        <w:t xml:space="preserve">It matches my readers’ position.</w:t>
+      </w:r>
+      <w:r>
+        <w:t xml:space="preserve"> </w:t>
+      </w:r>
+      <w:r>
+        <w:t xml:space="preserve">I am also new to Örebro, so I can approach the story as a newcomer.</w:t>
       </w:r>
     </w:p>
     <w:p>
@@ -492,35 +544,17 @@
         <w:t xml:space="preserve"> </w:t>
       </w:r>
       <w:r>
-        <w:t xml:space="preserve">Restaurants in Sweden had</w:t>
-      </w:r>
-      <w:r>
-        <w:t xml:space="preserve"> </w:t>
-      </w:r>
-      <w:r>
-        <w:t xml:space="preserve">“</w:t>
-      </w:r>
-      <w:r>
-        <w:t xml:space="preserve">yet another year with a record number of bankruptcies</w:t>
-      </w:r>
-      <w:r>
-        <w:t xml:space="preserve">”</w:t>
-      </w:r>
-      <w:r>
-        <w:t xml:space="preserve"> </w:t>
-      </w:r>
-      <w:r>
-        <w:t xml:space="preserve">in 2025 (Visita, 2026; my translation). Örebro ranks 245 of 290 municipalities on business climate (Ekonomifakta, 2026). The story can celebrate the opening without pretending it is easy.</w:t>
+        <w:t xml:space="preserve">National and municipal figures give context, though not evidence about this family. Across Sweden, bankruptcies stayed at historically high levels in 2025, with hotels and restaurants among the hardest-hit sectors (Realtid, 2026, reporting UC data). In Svenskt Näringsliv’s 2026 ranking, based mainly on a survey of local entrepreneurs, Örebro municipality placed 245th of 290, down from 211th in 2025 (Svenskt Näringsliv, 2026).</w:t>
       </w:r>
     </w:p>
     <w:bookmarkEnd w:id="22"/>
-    <w:bookmarkStart w:id="23" w:name="örebros-selling-points-through-this-lens"/>
+    <w:bookmarkStart w:id="23" w:name="Xd6581f264eb294a270417b5417a73ff00cb0147"/>
     <w:p>
       <w:pPr>
         <w:pStyle w:val="Heading2"/>
       </w:pPr>
       <w:r>
-        <w:t xml:space="preserve">4. Örebro’s selling points through this lens</w:t>
+        <w:t xml:space="preserve">4. What the region claims, and how I will test it</w:t>
       </w:r>
     </w:p>
     <w:tbl>
@@ -547,31 +581,31 @@
               <w:jc w:val="left"/>
             </w:pPr>
             <w:r>
-              <w:t xml:space="preserve">Selling point</w:t>
-            </w:r>
-          </w:p>
-        </w:tc>
-        <w:tc>
-          <w:tcPr/>
-          <w:p>
-            <w:pPr>
-              <w:pStyle w:val="Compact"/>
-              <w:jc w:val="left"/>
-            </w:pPr>
-            <w:r>
-              <w:t xml:space="preserve">Evidence</w:t>
-            </w:r>
-          </w:p>
-        </w:tc>
-        <w:tc>
-          <w:tcPr/>
-          <w:p>
-            <w:pPr>
-              <w:pStyle w:val="Compact"/>
-              <w:jc w:val="left"/>
-            </w:pPr>
-            <w:r>
-              <w:t xml:space="preserve">Where it shows in my texts</w:t>
+              <w:t xml:space="preserve">The region’s claim</w:t>
+            </w:r>
+          </w:p>
+        </w:tc>
+        <w:tc>
+          <w:tcPr/>
+          <w:p>
+            <w:pPr>
+              <w:pStyle w:val="Compact"/>
+              <w:jc w:val="left"/>
+            </w:pPr>
+            <w:r>
+              <w:t xml:space="preserve">Evidence the region or statistics offer</w:t>
+            </w:r>
+          </w:p>
+        </w:tc>
+        <w:tc>
+          <w:tcPr/>
+          <w:p>
+            <w:pPr>
+              <w:pStyle w:val="Compact"/>
+              <w:jc w:val="left"/>
+            </w:pPr>
+            <w:r>
+              <w:t xml:space="preserve">How the feature tests it</w:t>
             </w:r>
           </w:p>
         </w:tc>
@@ -585,19 +619,19 @@
               <w:jc w:val="left"/>
             </w:pPr>
             <w:r>
-              <w:t xml:space="preserve">A city where you can start something</w:t>
-            </w:r>
-          </w:p>
-        </w:tc>
-        <w:tc>
-          <w:tcPr/>
-          <w:p>
-            <w:pPr>
-              <w:pStyle w:val="Compact"/>
-              <w:jc w:val="left"/>
-            </w:pPr>
-            <w:r>
-              <w:t xml:space="preserve">The place story calls the region</w:t>
+              <w:t xml:space="preserve">A place where you can start something</w:t>
+            </w:r>
+          </w:p>
+        </w:tc>
+        <w:tc>
+          <w:tcPr/>
+          <w:p>
+            <w:pPr>
+              <w:pStyle w:val="Compact"/>
+              <w:jc w:val="left"/>
+            </w:pPr>
+            <w:r>
+              <w:t xml:space="preserve">The place story calls the county</w:t>
             </w:r>
             <w:r>
               <w:t xml:space="preserve"> </w:t>
@@ -612,19 +646,19 @@
               <w:t xml:space="preserve">”</w:t>
             </w:r>
             <w:r>
-              <w:t xml:space="preserve">. Örebro is Sweden’s seventh-largest municipality, with 160,140 residents in 2024, and grew 1.7% from 2022 to 2025 against 0.8% for the comparison (Ekonomifakta, 2026).</w:t>
-            </w:r>
-          </w:p>
-        </w:tc>
-        <w:tc>
-          <w:tcPr/>
-          <w:p>
-            <w:pPr>
-              <w:pStyle w:val="Compact"/>
-              <w:jc w:val="left"/>
-            </w:pPr>
-            <w:r>
-              <w:t xml:space="preserve">The owners’ story of choosing Örebro and opening here</w:t>
+              <w:t xml:space="preserve">. Örebro municipality grew 1.7% from 2022 to 2025 and is Sweden’s seventh-largest (Ekonomifakta, 2026).</w:t>
+            </w:r>
+          </w:p>
+        </w:tc>
+        <w:tc>
+          <w:tcPr/>
+          <w:p>
+            <w:pPr>
+              <w:pStyle w:val="Compact"/>
+              <w:jc w:val="left"/>
+            </w:pPr>
+            <w:r>
+              <w:t xml:space="preserve">When did opening here become realistic, what helped, what was the biggest unexpected difficulty</w:t>
             </w:r>
           </w:p>
         </w:tc>
@@ -638,19 +672,19 @@
               <w:jc w:val="left"/>
             </w:pPr>
             <w:r>
-              <w:t xml:space="preserve">A city shaped by people from everywhere</w:t>
-            </w:r>
-          </w:p>
-        </w:tc>
-        <w:tc>
-          <w:tcPr/>
-          <w:p>
-            <w:pPr>
-              <w:pStyle w:val="Compact"/>
-              <w:jc w:val="left"/>
-            </w:pPr>
-            <w:r>
-              <w:t xml:space="preserve">19.9% of Örebro’s residents were born abroad in 2024 (Statistics Sweden, 2025). Örebro University expects almost 200 exchange students from 27 countries this autumn, a record (Örebro University, 2026).</w:t>
+              <w:t xml:space="preserve">A place shaped by people from everywhere</w:t>
+            </w:r>
+          </w:p>
+        </w:tc>
+        <w:tc>
+          <w:tcPr/>
+          <w:p>
+            <w:pPr>
+              <w:pStyle w:val="Compact"/>
+              <w:jc w:val="left"/>
+            </w:pPr>
+            <w:r>
+              <w:t xml:space="preserve">19.9% of Örebro municipality’s residents were born abroad in 2024 (Statistics Sweden, 2025). Örebro University expects almost 200 exchange students this autumn, a record (Örebro University, 2026).</w:t>
             </w:r>
           </w:p>
         </w:tc>
@@ -676,31 +710,31 @@
               <w:jc w:val="left"/>
             </w:pPr>
             <w:r>
-              <w:t xml:space="preserve">A food city built on local produce and heritage</w:t>
-            </w:r>
-          </w:p>
-        </w:tc>
-        <w:tc>
-          <w:tcPr/>
-          <w:p>
-            <w:pPr>
-              <w:pStyle w:val="Compact"/>
-              <w:jc w:val="left"/>
-            </w:pPr>
-            <w:r>
-              <w:t xml:space="preserve">Pikeperch from Lake Hjälmaren, heritage grains and local farm produce (Region Örebro län, 2024). Cajsa Warg, Sweden’s best-known historical cookbook author, was born in Örebro in 1703 (Sjöberg, n.d.).</w:t>
-            </w:r>
-          </w:p>
-        </w:tc>
-        <w:tc>
-          <w:tcPr/>
-          <w:p>
-            <w:pPr>
-              <w:pStyle w:val="Compact"/>
-              <w:jc w:val="left"/>
-            </w:pPr>
-            <w:r>
-              <w:t xml:space="preserve">How the restaurant’s food fits into, or adds to, Örebro’s food culture</w:t>
+              <w:t xml:space="preserve">A food region built on local produce</w:t>
+            </w:r>
+          </w:p>
+        </w:tc>
+        <w:tc>
+          <w:tcPr/>
+          <w:p>
+            <w:pPr>
+              <w:pStyle w:val="Compact"/>
+              <w:jc w:val="left"/>
+            </w:pPr>
+            <w:r>
+              <w:t xml:space="preserve">Pikeperch from Lake Hjälmaren, heritage grains and farm produce (Region Örebro län, 2024). Cajsa Warg was born in Örebro in 1703 (Sjöberg, n.d.).</w:t>
+            </w:r>
+          </w:p>
+        </w:tc>
+        <w:tc>
+          <w:tcPr/>
+          <w:p>
+            <w:pPr>
+              <w:pStyle w:val="Compact"/>
+              <w:jc w:val="left"/>
+            </w:pPr>
+            <w:r>
+              <w:t xml:space="preserve">Where the restaurant’s food fits, and whether it uses local ingredients</w:t>
             </w:r>
           </w:p>
         </w:tc>
@@ -714,36 +748,30 @@
               <w:jc w:val="left"/>
             </w:pPr>
             <w:r>
-              <w:t xml:space="preserve">A neighbourly city</w:t>
-            </w:r>
-          </w:p>
-        </w:tc>
-        <w:tc>
-          <w:tcPr/>
-          <w:p>
-            <w:pPr>
-              <w:pStyle w:val="Compact"/>
-              <w:jc w:val="left"/>
-            </w:pPr>
-            <w:r>
-              <w:t xml:space="preserve">The place story says</w:t>
+              <w:t xml:space="preserve">A neighbourly place</w:t>
+            </w:r>
+          </w:p>
+        </w:tc>
+        <w:tc>
+          <w:tcPr/>
+          <w:p>
+            <w:pPr>
+              <w:pStyle w:val="Compact"/>
+              <w:jc w:val="left"/>
+            </w:pPr>
+            <w:r>
+              <w:t xml:space="preserve">“</w:t>
+            </w:r>
+            <w:r>
+              <w:t xml:space="preserve">Here good neighbours recommend one another</w:t>
+            </w:r>
+            <w:r>
+              <w:t xml:space="preserve">”</w:t>
             </w:r>
             <w:r>
               <w:t xml:space="preserve"> </w:t>
             </w:r>
             <w:r>
-              <w:t xml:space="preserve">“</w:t>
-            </w:r>
-            <w:r>
-              <w:t xml:space="preserve">here good neighbours recommend one another</w:t>
-            </w:r>
-            <w:r>
-              <w:t xml:space="preserve">”</w:t>
-            </w:r>
-            <w:r>
-              <w:t xml:space="preserve"> </w:t>
-            </w:r>
-            <w:r>
               <w:t xml:space="preserve">(Region Örebro län, 2024; my translation).</w:t>
             </w:r>
           </w:p>
@@ -756,20 +784,105 @@
               <w:jc w:val="left"/>
             </w:pPr>
             <w:r>
-              <w:t xml:space="preserve">What neighbours and nearby businesses say about the opening</w:t>
+              <w:t xml:space="preserve">How the neighbours and a nearby business owner have received the restaurant</w:t>
             </w:r>
           </w:p>
         </w:tc>
       </w:tr>
     </w:tbl>
     <w:bookmarkEnd w:id="23"/>
-    <w:bookmarkStart w:id="24" w:name="who-i-am-writing-for"/>
+    <w:bookmarkStart w:id="27" w:name="the-portfolio"/>
     <w:p>
       <w:pPr>
         <w:pStyle w:val="Heading2"/>
       </w:pPr>
       <w:r>
-        <w:t xml:space="preserve">5. Who I am writing for</w:t>
+        <w:t xml:space="preserve">5. The portfolio</w:t>
+      </w:r>
+    </w:p>
+    <w:bookmarkStart w:id="24" w:name="the-feature"/>
+    <w:p>
+      <w:pPr>
+        <w:pStyle w:val="Heading3"/>
+      </w:pPr>
+      <w:r>
+        <w:t xml:space="preserve">The feature</w:t>
+      </w:r>
+    </w:p>
+    <w:p>
+      <w:pPr>
+        <w:numPr>
+          <w:ilvl w:val="0"/>
+          <w:numId w:val="1002"/>
+        </w:numPr>
+        <w:pStyle w:val="Compact"/>
+      </w:pPr>
+      <w:r>
+        <w:rPr>
+          <w:bCs/>
+          <w:b/>
+        </w:rPr>
+        <w:t xml:space="preserve">Length:</w:t>
+      </w:r>
+      <w:r>
+        <w:t xml:space="preserve"> </w:t>
+      </w:r>
+      <w:r>
+        <w:t xml:space="preserve">about 800 to 1,200 words.</w:t>
+      </w:r>
+    </w:p>
+    <w:p>
+      <w:pPr>
+        <w:numPr>
+          <w:ilvl w:val="0"/>
+          <w:numId w:val="1002"/>
+        </w:numPr>
+        <w:pStyle w:val="Compact"/>
+      </w:pPr>
+      <w:r>
+        <w:rPr>
+          <w:bCs/>
+          <w:b/>
+        </w:rPr>
+        <w:t xml:space="preserve">Where it would appear:</w:t>
+      </w:r>
+      <w:r>
+        <w:t xml:space="preserve"> </w:t>
+      </w:r>
+      <w:r>
+        <w:t xml:space="preserve">The Local Sweden, the English-language news site whose readers are largely international residents and newcomers in Sweden.</w:t>
+      </w:r>
+    </w:p>
+    <w:p>
+      <w:pPr>
+        <w:numPr>
+          <w:ilvl w:val="0"/>
+          <w:numId w:val="1002"/>
+        </w:numPr>
+        <w:pStyle w:val="Compact"/>
+      </w:pPr>
+      <w:r>
+        <w:rPr>
+          <w:bCs/>
+          <w:b/>
+        </w:rPr>
+        <w:t xml:space="preserve">Why it matters to international students and other newcomers:</w:t>
+      </w:r>
+      <w:r>
+        <w:t xml:space="preserve"> </w:t>
+      </w:r>
+      <w:r>
+        <w:t xml:space="preserve">Anyone who moves to Örebro asks the question this family is answering in practice: can I build something here? A concrete, honest account of a family’s first weeks, and of how the neighbourhood has received them, tells newcomers more about everyday Örebro than a brochure can. It also points them to a place to eat and meet people beyond campus.</w:t>
+      </w:r>
+    </w:p>
+    <w:bookmarkEnd w:id="24"/>
+    <w:bookmarkStart w:id="25" w:name="three-social-media-posts"/>
+    <w:p>
+      <w:pPr>
+        <w:pStyle w:val="Heading3"/>
+      </w:pPr>
+      <w:r>
+        <w:t xml:space="preserve">Three social media posts</w:t>
       </w:r>
     </w:p>
     <w:p>
@@ -777,7 +890,7 @@
         <w:pStyle w:val="FirstParagraph"/>
       </w:pPr>
       <w:r>
-        <w:t xml:space="preserve">The feature is the main piece. I will then reuse its core message and one photograph from my visit in three short social media posts, each adapted to a different audience. I chose the platforms from Swedish usage data rather than my own habits, because the same platform can mean very different things in different countries.</w:t>
+        <w:t xml:space="preserve">Each post reuses the feature’s core message and one photograph from my visits, adapted to a specific audience and purpose. I chose the platforms from Swedish usage data rather than my own habits, because platform habits differ between countries.</w:t>
       </w:r>
     </w:p>
     <w:tbl>
@@ -805,19 +918,31 @@
               <w:jc w:val="left"/>
             </w:pPr>
             <w:r>
-              <w:t xml:space="preserve">Text</w:t>
-            </w:r>
-          </w:p>
-        </w:tc>
-        <w:tc>
-          <w:tcPr/>
-          <w:p>
-            <w:pPr>
-              <w:pStyle w:val="Compact"/>
-              <w:jc w:val="left"/>
-            </w:pPr>
-            <w:r>
-              <w:t xml:space="preserve">Target group</w:t>
+              <w:t xml:space="preserve">Platform</w:t>
+            </w:r>
+          </w:p>
+        </w:tc>
+        <w:tc>
+          <w:tcPr/>
+          <w:p>
+            <w:pPr>
+              <w:pStyle w:val="Compact"/>
+              <w:jc w:val="left"/>
+            </w:pPr>
+            <w:r>
+              <w:t xml:space="preserve">Specific audience</w:t>
+            </w:r>
+          </w:p>
+        </w:tc>
+        <w:tc>
+          <w:tcPr/>
+          <w:p>
+            <w:pPr>
+              <w:pStyle w:val="Compact"/>
+              <w:jc w:val="left"/>
+            </w:pPr>
+            <w:r>
+              <w:t xml:space="preserve">Purpose</w:t>
             </w:r>
           </w:p>
         </w:tc>
@@ -830,18 +955,6 @@
             </w:pPr>
             <w:r>
               <w:t xml:space="preserve">Why this platform</w:t>
-            </w:r>
-          </w:p>
-        </w:tc>
-        <w:tc>
-          <w:tcPr/>
-          <w:p>
-            <w:pPr>
-              <w:pStyle w:val="Compact"/>
-              <w:jc w:val="left"/>
-            </w:pPr>
-            <w:r>
-              <w:t xml:space="preserve">Format</w:t>
             </w:r>
           </w:p>
         </w:tc>
@@ -855,43 +968,43 @@
               <w:jc w:val="left"/>
             </w:pPr>
             <w:r>
-              <w:t xml:space="preserve">Feature</w:t>
-            </w:r>
-          </w:p>
-        </w:tc>
-        <w:tc>
-          <w:tcPr/>
-          <w:p>
-            <w:pPr>
-              <w:pStyle w:val="Compact"/>
-              <w:jc w:val="left"/>
-            </w:pPr>
-            <w:r>
-              <w:t xml:space="preserve">International students and other newcomers to Örebro</w:t>
-            </w:r>
-          </w:p>
-        </w:tc>
-        <w:tc>
-          <w:tcPr/>
-          <w:p>
-            <w:pPr>
-              <w:pStyle w:val="Compact"/>
-              <w:jc w:val="left"/>
-            </w:pPr>
-            <w:r>
-              <w:t xml:space="preserve">The main story, read in full</w:t>
-            </w:r>
-          </w:p>
-        </w:tc>
-        <w:tc>
-          <w:tcPr/>
-          <w:p>
-            <w:pPr>
-              <w:pStyle w:val="Compact"/>
-              <w:jc w:val="left"/>
-            </w:pPr>
-            <w:r>
-              <w:t xml:space="preserve">900 to 1,200 words, for a student magazine or the Örebro University news site</w:t>
+              <w:t xml:space="preserve">Instagram</w:t>
+            </w:r>
+          </w:p>
+        </w:tc>
+        <w:tc>
+          <w:tcPr/>
+          <w:p>
+            <w:pPr>
+              <w:pStyle w:val="Compact"/>
+              <w:jc w:val="left"/>
+            </w:pPr>
+            <w:r>
+              <w:t xml:space="preserve">Students at Örebro University, international and Swedish</w:t>
+            </w:r>
+          </w:p>
+        </w:tc>
+        <w:tc>
+          <w:tcPr/>
+          <w:p>
+            <w:pPr>
+              <w:pStyle w:val="Compact"/>
+              <w:jc w:val="left"/>
+            </w:pPr>
+            <w:r>
+              <w:t xml:space="preserve">Introduce the people behind the restaurant</w:t>
+            </w:r>
+          </w:p>
+        </w:tc>
+        <w:tc>
+          <w:tcPr/>
+          <w:p>
+            <w:pPr>
+              <w:pStyle w:val="Compact"/>
+              <w:jc w:val="left"/>
+            </w:pPr>
+            <w:r>
+              <w:t xml:space="preserve">69% of Swedes born in the 1990s and 65% born in the 2000s use Instagram daily (Internetstiftelsen, 2025)</w:t>
             </w:r>
           </w:p>
         </w:tc>
@@ -905,43 +1018,61 @@
               <w:jc w:val="left"/>
             </w:pPr>
             <w:r>
-              <w:t xml:space="preserve">Instagram</w:t>
-            </w:r>
-          </w:p>
-        </w:tc>
-        <w:tc>
-          <w:tcPr/>
-          <w:p>
-            <w:pPr>
-              <w:pStyle w:val="Compact"/>
-              <w:jc w:val="left"/>
-            </w:pPr>
-            <w:r>
-              <w:t xml:space="preserve">Gen Z and younger millennials in Örebro, roughly 18 to 35</w:t>
-            </w:r>
-          </w:p>
-        </w:tc>
-        <w:tc>
-          <w:tcPr/>
-          <w:p>
-            <w:pPr>
-              <w:pStyle w:val="Compact"/>
-              <w:jc w:val="left"/>
-            </w:pPr>
-            <w:r>
-              <w:t xml:space="preserve">69% of Swedes born in the 1990s and 65% born in the 2000s use Instagram daily (Internetstiftelsen, 2025)</w:t>
-            </w:r>
-          </w:p>
-        </w:tc>
-        <w:tc>
-          <w:tcPr/>
-          <w:p>
-            <w:pPr>
-              <w:pStyle w:val="Compact"/>
-              <w:jc w:val="left"/>
-            </w:pPr>
-            <w:r>
-              <w:t xml:space="preserve">The photo first, a short caption and a few hashtags</w:t>
+              <w:t xml:space="preserve">Facebook</w:t>
+            </w:r>
+          </w:p>
+        </w:tc>
+        <w:tc>
+          <w:tcPr/>
+          <w:p>
+            <w:pPr>
+              <w:pStyle w:val="Compact"/>
+              <w:jc w:val="left"/>
+            </w:pPr>
+            <w:r>
+              <w:t xml:space="preserve">Residents of the neighbourhood around Karlsdalsallén</w:t>
+            </w:r>
+          </w:p>
+        </w:tc>
+        <w:tc>
+          <w:tcPr/>
+          <w:p>
+            <w:pPr>
+              <w:pStyle w:val="Compact"/>
+              <w:jc w:val="left"/>
+            </w:pPr>
+            <w:r>
+              <w:t xml:space="preserve">Tell neighbours who has opened in the old restaurant’s premises, with practical details, and invite them in</w:t>
+            </w:r>
+          </w:p>
+        </w:tc>
+        <w:tc>
+          <w:tcPr/>
+          <w:p>
+            <w:pPr>
+              <w:pStyle w:val="Compact"/>
+              <w:jc w:val="left"/>
+            </w:pPr>
+            <w:r>
+              <w:t xml:space="preserve">In Sweden Facebook</w:t>
+            </w:r>
+            <w:r>
+              <w:t xml:space="preserve"> </w:t>
+            </w:r>
+            <w:r>
+              <w:t xml:space="preserve">“</w:t>
+            </w:r>
+            <w:r>
+              <w:t xml:space="preserve">dominates among older</w:t>
+            </w:r>
+            <w:r>
+              <w:t xml:space="preserve">”</w:t>
+            </w:r>
+            <w:r>
+              <w:t xml:space="preserve"> </w:t>
+            </w:r>
+            <w:r>
+              <w:t xml:space="preserve">users: 62 to 64% of those born in the 1950s to 1980s use it daily (Internetstiftelsen, 2025)</w:t>
             </w:r>
           </w:p>
         </w:tc>
@@ -955,74 +1086,6 @@
               <w:jc w:val="left"/>
             </w:pPr>
             <w:r>
-              <w:t xml:space="preserve">Facebook</w:t>
-            </w:r>
-          </w:p>
-        </w:tc>
-        <w:tc>
-          <w:tcPr/>
-          <w:p>
-            <w:pPr>
-              <w:pStyle w:val="Compact"/>
-              <w:jc w:val="left"/>
-            </w:pPr>
-            <w:r>
-              <w:t xml:space="preserve">Örebro residents roughly 35 to 65, including families and neighbours</w:t>
-            </w:r>
-          </w:p>
-        </w:tc>
-        <w:tc>
-          <w:tcPr/>
-          <w:p>
-            <w:pPr>
-              <w:pStyle w:val="Compact"/>
-              <w:jc w:val="left"/>
-            </w:pPr>
-            <w:r>
-              <w:t xml:space="preserve">In Sweden Facebook</w:t>
-            </w:r>
-            <w:r>
-              <w:t xml:space="preserve"> </w:t>
-            </w:r>
-            <w:r>
-              <w:t xml:space="preserve">“</w:t>
-            </w:r>
-            <w:r>
-              <w:t xml:space="preserve">dominates among older</w:t>
-            </w:r>
-            <w:r>
-              <w:t xml:space="preserve">”</w:t>
-            </w:r>
-            <w:r>
-              <w:t xml:space="preserve"> </w:t>
-            </w:r>
-            <w:r>
-              <w:t xml:space="preserve">users: 62 to 64% of those born in the 1950s to 1980s use it daily, against 25% of those born in the 2000s (Internetstiftelsen, 2025)</w:t>
-            </w:r>
-          </w:p>
-        </w:tc>
-        <w:tc>
-          <w:tcPr/>
-          <w:p>
-            <w:pPr>
-              <w:pStyle w:val="Compact"/>
-              <w:jc w:val="left"/>
-            </w:pPr>
-            <w:r>
-              <w:t xml:space="preserve">The same photo, a longer neighbourly post with practical details and a link to the feature</w:t>
-            </w:r>
-          </w:p>
-        </w:tc>
-      </w:tr>
-      <w:tr>
-        <w:tc>
-          <w:tcPr/>
-          <w:p>
-            <w:pPr>
-              <w:pStyle w:val="Compact"/>
-              <w:jc w:val="left"/>
-            </w:pPr>
-            <w:r>
               <w:t xml:space="preserve">LinkedIn</w:t>
             </w:r>
           </w:p>
@@ -1035,7 +1098,19 @@
               <w:jc w:val="left"/>
             </w:pPr>
             <w:r>
-              <w:t xml:space="preserve">Local professionals and potential partners: business networks, food producers, student associations</w:t>
+              <w:t xml:space="preserve">Örebro’s local business community and people considering starting a business</w:t>
+            </w:r>
+          </w:p>
+        </w:tc>
+        <w:tc>
+          <w:tcPr/>
+          <w:p>
+            <w:pPr>
+              <w:pStyle w:val="Compact"/>
+              <w:jc w:val="left"/>
+            </w:pPr>
+            <w:r>
+              <w:t xml:space="preserve">Share what starting a local business in Örebro has been like: what helped and what was hard</w:t>
             </w:r>
           </w:p>
         </w:tc>
@@ -1048,38 +1123,45 @@
             </w:pPr>
             <w:r>
               <w:t xml:space="preserve">42% of Swedes born in the 1970s to 1990s used LinkedIn in the past year (Internetstiftelsen, 2025)</w:t>
-            </w:r>
-          </w:p>
-        </w:tc>
-        <w:tc>
-          <w:tcPr/>
-          <w:p>
-            <w:pPr>
-              <w:pStyle w:val="Compact"/>
-              <w:jc w:val="left"/>
-            </w:pPr>
-            <w:r>
-              <w:t xml:space="preserve">The same photo, a professional post on starting a business in Örebro, with one statistic, one quotation and one call to action</w:t>
             </w:r>
           </w:p>
         </w:tc>
       </w:tr>
     </w:tbl>
-    <w:bookmarkEnd w:id="24"/>
-    <w:bookmarkStart w:id="25" w:name="challenges-i-will-address-honestly"/>
+    <w:bookmarkEnd w:id="25"/>
+    <w:bookmarkStart w:id="26" w:name="theoretical-brief"/>
+    <w:p>
+      <w:pPr>
+        <w:pStyle w:val="Heading3"/>
+      </w:pPr>
+      <w:r>
+        <w:t xml:space="preserve">Theoretical brief</w:t>
+      </w:r>
+    </w:p>
+    <w:p>
+      <w:pPr>
+        <w:pStyle w:val="FirstParagraph"/>
+      </w:pPr>
+      <w:r>
+        <w:t xml:space="preserve">A short brief will explain the place-branding purpose, the research, the audience choices and how I applied the course readings, especially Kavaratzis (2004), Smith and Friedmann.</w:t>
+      </w:r>
+    </w:p>
+    <w:bookmarkEnd w:id="26"/>
+    <w:bookmarkEnd w:id="27"/>
+    <w:bookmarkStart w:id="28" w:name="context-and-challenges-with-their-scope"/>
     <w:p>
       <w:pPr>
         <w:pStyle w:val="Heading2"/>
       </w:pPr>
       <w:r>
-        <w:t xml:space="preserve">6. Challenges I will address honestly</w:t>
-      </w:r>
-    </w:p>
-    <w:p>
-      <w:pPr>
-        <w:numPr>
-          <w:ilvl w:val="0"/>
-          <w:numId w:val="1002"/>
+        <w:t xml:space="preserve">6. Context and challenges, with their scope</w:t>
+      </w:r>
+    </w:p>
+    <w:p>
+      <w:pPr>
+        <w:numPr>
+          <w:ilvl w:val="0"/>
+          <w:numId w:val="1003"/>
         </w:numPr>
         <w:pStyle w:val="Compact"/>
       </w:pPr>
@@ -1088,20 +1170,38 @@
           <w:bCs/>
           <w:b/>
         </w:rPr>
-        <w:t xml:space="preserve">A hard market.</w:t>
-      </w:r>
-      <w:r>
-        <w:t xml:space="preserve"> </w:t>
-      </w:r>
-      <w:r>
-        <w:t xml:space="preserve">Restaurant bankruptcies in Sweden reached record levels again in 2025, and rising purchase prices hit restaurants hardest (Visita, 2026).</w:t>
-      </w:r>
-    </w:p>
-    <w:p>
-      <w:pPr>
-        <w:numPr>
-          <w:ilvl w:val="0"/>
-          <w:numId w:val="1002"/>
+        <w:t xml:space="preserve">National:</w:t>
+      </w:r>
+      <w:r>
+        <w:t xml:space="preserve"> </w:t>
+      </w:r>
+      <w:r>
+        <w:t xml:space="preserve">bankruptcies in Sweden stayed at historically high levels in 2025, and hotels and restaurants were among the sectors with the most (Realtid, 2026, reporting UC data). The industry body Visita called 2025</w:t>
+      </w:r>
+      <w:r>
+        <w:t xml:space="preserve"> </w:t>
+      </w:r>
+      <w:r>
+        <w:t xml:space="preserve">“</w:t>
+      </w:r>
+      <w:r>
+        <w:t xml:space="preserve">yet another year with a record number of bankruptcies</w:t>
+      </w:r>
+      <w:r>
+        <w:t xml:space="preserve">”</w:t>
+      </w:r>
+      <w:r>
+        <w:t xml:space="preserve"> </w:t>
+      </w:r>
+      <w:r>
+        <w:t xml:space="preserve">for restaurants (Visita, 2026; my translation). That is Visita’s characterisation, attributed as such.</w:t>
+      </w:r>
+    </w:p>
+    <w:p>
+      <w:pPr>
+        <w:numPr>
+          <w:ilvl w:val="0"/>
+          <w:numId w:val="1003"/>
         </w:numPr>
         <w:pStyle w:val="Compact"/>
       </w:pPr>
@@ -1110,20 +1210,20 @@
           <w:bCs/>
           <w:b/>
         </w:rPr>
-        <w:t xml:space="preserve">Örebro’s business figures lag behind its story.</w:t>
-      </w:r>
-      <w:r>
-        <w:t xml:space="preserve"> </w:t>
-      </w:r>
-      <w:r>
-        <w:t xml:space="preserve">Örebro had 8.6 new businesses per 1,000 residents aged 15 to 74 in 2025, against 9.7 for the comparison, and unemployment of 7.6% against 6.9% (Ekonomifakta, 2026).</w:t>
-      </w:r>
-    </w:p>
-    <w:p>
-      <w:pPr>
-        <w:numPr>
-          <w:ilvl w:val="0"/>
-          <w:numId w:val="1002"/>
+        <w:t xml:space="preserve">Municipal:</w:t>
+      </w:r>
+      <w:r>
+        <w:t xml:space="preserve"> </w:t>
+      </w:r>
+      <w:r>
+        <w:t xml:space="preserve">Örebro placed 245th of 290 in Svenskt Näringsliv’s 2026 business-climate ranking. The ranking measures local entrepreneurs’ perceptions, not any single firm’s results.</w:t>
+      </w:r>
+    </w:p>
+    <w:p>
+      <w:pPr>
+        <w:numPr>
+          <w:ilvl w:val="0"/>
+          <w:numId w:val="1003"/>
         </w:numPr>
         <w:pStyle w:val="Compact"/>
       </w:pPr>
@@ -1132,20 +1232,32 @@
           <w:bCs/>
           <w:b/>
         </w:rPr>
-        <w:t xml:space="preserve">The premises have a history.</w:t>
-      </w:r>
-      <w:r>
-        <w:t xml:space="preserve"> </w:t>
-      </w:r>
-      <w:r>
-        <w:t xml:space="preserve">The previous restaurant in the same space closed. I will find out what neighbours and the owners know about it.</w:t>
-      </w:r>
-    </w:p>
-    <w:p>
-      <w:pPr>
-        <w:numPr>
-          <w:ilvl w:val="0"/>
-          <w:numId w:val="1002"/>
+        <w:t xml:space="preserve">Regional:</w:t>
+      </w:r>
+      <w:r>
+        <w:t xml:space="preserve"> </w:t>
+      </w:r>
+      <w:r>
+        <w:t xml:space="preserve">“</w:t>
+      </w:r>
+      <w:r>
+        <w:t xml:space="preserve">The place of opportunities</w:t>
+      </w:r>
+      <w:r>
+        <w:t xml:space="preserve">”</w:t>
+      </w:r>
+      <w:r>
+        <w:t xml:space="preserve"> </w:t>
+      </w:r>
+      <w:r>
+        <w:t xml:space="preserve">is a county-wide tourism narrative, so the feature tests it rather than repeats it.</w:t>
+      </w:r>
+    </w:p>
+    <w:p>
+      <w:pPr>
+        <w:numPr>
+          <w:ilvl w:val="0"/>
+          <w:numId w:val="1003"/>
         </w:numPr>
         <w:pStyle w:val="Compact"/>
       </w:pPr>
@@ -1154,20 +1266,20 @@
           <w:bCs/>
           <w:b/>
         </w:rPr>
-        <w:t xml:space="preserve">Language.</w:t>
-      </w:r>
-      <w:r>
-        <w:t xml:space="preserve"> </w:t>
-      </w:r>
-      <w:r>
-        <w:t xml:space="preserve">Hannah is more comfortable in another language than English. I will handle this as described in section 11.</w:t>
-      </w:r>
-    </w:p>
-    <w:p>
-      <w:pPr>
-        <w:numPr>
-          <w:ilvl w:val="0"/>
-          <w:numId w:val="1002"/>
+        <w:t xml:space="preserve">The premises:</w:t>
+      </w:r>
+      <w:r>
+        <w:t xml:space="preserve"> </w:t>
+      </w:r>
+      <w:r>
+        <w:t xml:space="preserve">the previous restaurant in the same space closed. I will ask what the owners and neighbours know about it.</w:t>
+      </w:r>
+    </w:p>
+    <w:p>
+      <w:pPr>
+        <w:numPr>
+          <w:ilvl w:val="0"/>
+          <w:numId w:val="1003"/>
         </w:numPr>
         <w:pStyle w:val="Compact"/>
       </w:pPr>
@@ -1176,38 +1288,30 @@
           <w:bCs/>
           <w:b/>
         </w:rPr>
-        <w:t xml:space="preserve">No single famous dish.</w:t>
-      </w:r>
-      <w:r>
-        <w:t xml:space="preserve"> </w:t>
-      </w:r>
-      <w:r>
-        <w:t xml:space="preserve">Örebro is known for local produce rather than one signature dish. I will ask where the restaurant’s own food fits.</w:t>
-      </w:r>
-    </w:p>
-    <w:bookmarkEnd w:id="25"/>
-    <w:bookmarkStart w:id="26" w:name="questions-my-portfolio-will-answer"/>
+        <w:t xml:space="preserve">Language:</w:t>
+      </w:r>
+      <w:r>
+        <w:t xml:space="preserve"> </w:t>
+      </w:r>
+      <w:r>
+        <w:t xml:space="preserve">Hannah is more comfortable in Swedish than English. I will handle this as described in section 11.</w:t>
+      </w:r>
+    </w:p>
+    <w:bookmarkEnd w:id="28"/>
+    <w:bookmarkStart w:id="29" w:name="questions-the-portfolio-will-answer"/>
     <w:p>
       <w:pPr>
         <w:pStyle w:val="Heading2"/>
       </w:pPr>
       <w:r>
-        <w:t xml:space="preserve">7. Questions my portfolio will answer</w:t>
-      </w:r>
-    </w:p>
-    <w:p>
-      <w:pPr>
-        <w:pStyle w:val="FirstParagraph"/>
-      </w:pPr>
-      <w:r>
-        <w:t xml:space="preserve">These six questions guide all four texts. Section 10 shows which interview questions and sources answer each one.</w:t>
-      </w:r>
-    </w:p>
-    <w:p>
-      <w:pPr>
-        <w:numPr>
-          <w:ilvl w:val="0"/>
-          <w:numId w:val="1003"/>
+        <w:t xml:space="preserve">7. Questions the portfolio will answer</w:t>
+      </w:r>
+    </w:p>
+    <w:p>
+      <w:pPr>
+        <w:numPr>
+          <w:ilvl w:val="0"/>
+          <w:numId w:val="1004"/>
         </w:numPr>
         <w:pStyle w:val="Compact"/>
       </w:pPr>
@@ -1222,14 +1326,14 @@
         <w:t xml:space="preserve"> </w:t>
       </w:r>
       <w:r>
-        <w:t xml:space="preserve">Who are the people behind [[RESTAURANT NAME]], and why did they choose Örebro and this street?</w:t>
-      </w:r>
-    </w:p>
-    <w:p>
-      <w:pPr>
-        <w:numPr>
-          <w:ilvl w:val="0"/>
-          <w:numId w:val="1003"/>
+        <w:t xml:space="preserve">Who are the people behind Tomasii Restaurang, and how did opening here become a realistic possibility for them?</w:t>
+      </w:r>
+    </w:p>
+    <w:p>
+      <w:pPr>
+        <w:numPr>
+          <w:ilvl w:val="0"/>
+          <w:numId w:val="1004"/>
         </w:numPr>
         <w:pStyle w:val="Compact"/>
       </w:pPr>
@@ -1244,14 +1348,14 @@
         <w:t xml:space="preserve"> </w:t>
       </w:r>
       <w:r>
-        <w:t xml:space="preserve">What does the restaurant add to Örebro’s food culture, and how does it relate to the city’s local-produce identity?</w:t>
-      </w:r>
-    </w:p>
-    <w:p>
-      <w:pPr>
-        <w:numPr>
-          <w:ilvl w:val="0"/>
-          <w:numId w:val="1003"/>
+        <w:t xml:space="preserve">What does the restaurant add to the area’s food, and how does it relate to the region’s local-produce identity?</w:t>
+      </w:r>
+    </w:p>
+    <w:p>
+      <w:pPr>
+        <w:numPr>
+          <w:ilvl w:val="0"/>
+          <w:numId w:val="1004"/>
         </w:numPr>
         <w:pStyle w:val="Compact"/>
       </w:pPr>
@@ -1266,14 +1370,14 @@
         <w:t xml:space="preserve"> </w:t>
       </w:r>
       <w:r>
-        <w:t xml:space="preserve">Who comes to eat there, and what does that say about who lives in this part of Örebro and what they like?</w:t>
-      </w:r>
-    </w:p>
-    <w:p>
-      <w:pPr>
-        <w:numPr>
-          <w:ilvl w:val="0"/>
-          <w:numId w:val="1003"/>
+        <w:t xml:space="preserve">Who has come to eat there in the first weeks?</w:t>
+      </w:r>
+    </w:p>
+    <w:p>
+      <w:pPr>
+        <w:numPr>
+          <w:ilvl w:val="0"/>
+          <w:numId w:val="1004"/>
         </w:numPr>
         <w:pStyle w:val="Compact"/>
       </w:pPr>
@@ -1288,14 +1392,14 @@
         <w:t xml:space="preserve"> </w:t>
       </w:r>
       <w:r>
-        <w:t xml:space="preserve">What has it been like to open a new business in Örebro in 2026: what helped, and what has been hard?</w:t>
-      </w:r>
-    </w:p>
-    <w:p>
-      <w:pPr>
-        <w:numPr>
-          <w:ilvl w:val="0"/>
-          <w:numId w:val="1003"/>
+        <w:t xml:space="preserve">What has it been like to start a business in Örebro in practice: what helped, and what has been the biggest unexpected difficulty?</w:t>
+      </w:r>
+    </w:p>
+    <w:p>
+      <w:pPr>
+        <w:numPr>
+          <w:ilvl w:val="0"/>
+          <w:numId w:val="1004"/>
         </w:numPr>
         <w:pStyle w:val="Compact"/>
       </w:pPr>
@@ -1310,14 +1414,14 @@
         <w:t xml:space="preserve"> </w:t>
       </w:r>
       <w:r>
-        <w:t xml:space="preserve">What does the street and neighbourhood gain from the opening, according to neighbours and nearby businesses?</w:t>
-      </w:r>
-    </w:p>
-    <w:p>
-      <w:pPr>
-        <w:numPr>
-          <w:ilvl w:val="0"/>
-          <w:numId w:val="1003"/>
+        <w:t xml:space="preserve">How have the street and its neighbours received the restaurant?</w:t>
+      </w:r>
+    </w:p>
+    <w:p>
+      <w:pPr>
+        <w:numPr>
+          <w:ilvl w:val="0"/>
+          <w:numId w:val="1004"/>
         </w:numPr>
         <w:pStyle w:val="Compact"/>
       </w:pPr>
@@ -1332,7 +1436,7 @@
         <w:t xml:space="preserve"> </w:t>
       </w:r>
       <w:r>
-        <w:t xml:space="preserve">Does this family’s experience support Örebro’s promise of being</w:t>
+        <w:t xml:space="preserve">How far does this family’s experience support the region’s claim to be</w:t>
       </w:r>
       <w:r>
         <w:t xml:space="preserve"> </w:t>
@@ -1347,17 +1451,17 @@
         <w:t xml:space="preserve">”</w:t>
       </w:r>
       <w:r>
-        <w:t xml:space="preserve">, and what should a newcomer know?</w:t>
-      </w:r>
-    </w:p>
-    <w:bookmarkEnd w:id="26"/>
-    <w:bookmarkStart w:id="27" w:name="who-i-will-interview"/>
+        <w:t xml:space="preserve">, given that one restaurant cannot speak for the whole city?</w:t>
+      </w:r>
+    </w:p>
+    <w:bookmarkEnd w:id="29"/>
+    <w:bookmarkStart w:id="30" w:name="who-i-will-interview-in-priority-order"/>
     <w:p>
       <w:pPr>
         <w:pStyle w:val="Heading2"/>
       </w:pPr>
       <w:r>
-        <w:t xml:space="preserve">8. Who I will interview</w:t>
+        <w:t xml:space="preserve">8. Who I will interview, in priority order</w:t>
       </w:r>
     </w:p>
     <w:tbl>
@@ -1384,6 +1488,18 @@
               <w:jc w:val="left"/>
             </w:pPr>
             <w:r>
+              <w:t xml:space="preserve">Priority</w:t>
+            </w:r>
+          </w:p>
+        </w:tc>
+        <w:tc>
+          <w:tcPr/>
+          <w:p>
+            <w:pPr>
+              <w:pStyle w:val="Compact"/>
+              <w:jc w:val="left"/>
+            </w:pPr>
+            <w:r>
               <w:t xml:space="preserve">Who</w:t>
             </w:r>
           </w:p>
@@ -1397,18 +1513,6 @@
             </w:pPr>
             <w:r>
               <w:t xml:space="preserve">Why</w:t>
-            </w:r>
-          </w:p>
-        </w:tc>
-        <w:tc>
-          <w:tcPr/>
-          <w:p>
-            <w:pPr>
-              <w:pStyle w:val="Compact"/>
-              <w:jc w:val="left"/>
-            </w:pPr>
-            <w:r>
-              <w:t xml:space="preserve">When</w:t>
             </w:r>
           </w:p>
         </w:tc>
@@ -1422,6 +1526,18 @@
               <w:jc w:val="left"/>
             </w:pPr>
             <w:r>
+              <w:t xml:space="preserve">Essential</w:t>
+            </w:r>
+          </w:p>
+        </w:tc>
+        <w:tc>
+          <w:tcPr/>
+          <w:p>
+            <w:pPr>
+              <w:pStyle w:val="Compact"/>
+              <w:jc w:val="left"/>
+            </w:pPr>
+            <w:r>
               <w:t xml:space="preserve">Hannah and her husband, the owners</w:t>
             </w:r>
           </w:p>
@@ -1434,19 +1550,7 @@
               <w:jc w:val="left"/>
             </w:pPr>
             <w:r>
-              <w:t xml:space="preserve">The central story and main quotations of the feature</w:t>
-            </w:r>
-          </w:p>
-        </w:tc>
-        <w:tc>
-          <w:tcPr/>
-          <w:p>
-            <w:pPr>
-              <w:pStyle w:val="Compact"/>
-              <w:jc w:val="left"/>
-            </w:pPr>
-            <w:r>
-              <w:t xml:space="preserve">Monday 19 October, about 40 minutes at the restaurant</w:t>
+              <w:t xml:space="preserve">The central story of the feature</w:t>
             </w:r>
           </w:p>
         </w:tc>
@@ -1460,31 +1564,31 @@
               <w:jc w:val="left"/>
             </w:pPr>
             <w:r>
-              <w:t xml:space="preserve">A staff member, if they employ anyone outside the family</w:t>
-            </w:r>
-          </w:p>
-        </w:tc>
-        <w:tc>
-          <w:tcPr/>
-          <w:p>
-            <w:pPr>
-              <w:pStyle w:val="Compact"/>
-              <w:jc w:val="left"/>
-            </w:pPr>
-            <w:r>
-              <w:t xml:space="preserve">A day-to-day view of the restaurant and its guests</w:t>
-            </w:r>
-          </w:p>
-        </w:tc>
-        <w:tc>
-          <w:tcPr/>
-          <w:p>
-            <w:pPr>
-              <w:pStyle w:val="Compact"/>
-              <w:jc w:val="left"/>
-            </w:pPr>
-            <w:r>
-              <w:t xml:space="preserve">Same visit or the following days</w:t>
+              <w:t xml:space="preserve">Essential</w:t>
+            </w:r>
+          </w:p>
+        </w:tc>
+        <w:tc>
+          <w:tcPr/>
+          <w:p>
+            <w:pPr>
+              <w:pStyle w:val="Compact"/>
+              <w:jc w:val="left"/>
+            </w:pPr>
+            <w:r>
+              <w:t xml:space="preserve">One customer</w:t>
+            </w:r>
+          </w:p>
+        </w:tc>
+        <w:tc>
+          <w:tcPr/>
+          <w:p>
+            <w:pPr>
+              <w:pStyle w:val="Compact"/>
+              <w:jc w:val="left"/>
+            </w:pPr>
+            <w:r>
+              <w:t xml:space="preserve">An outside view of the restaurant and why people come</w:t>
             </w:r>
           </w:p>
         </w:tc>
@@ -1498,31 +1602,31 @@
               <w:jc w:val="left"/>
             </w:pPr>
             <w:r>
-              <w:t xml:space="preserve">Two or three customers</w:t>
-            </w:r>
-          </w:p>
-        </w:tc>
-        <w:tc>
-          <w:tcPr/>
-          <w:p>
-            <w:pPr>
-              <w:pStyle w:val="Compact"/>
-              <w:jc w:val="left"/>
-            </w:pPr>
-            <w:r>
-              <w:t xml:space="preserve">Who comes, why, and an outside view of the place</w:t>
-            </w:r>
-          </w:p>
-        </w:tc>
-        <w:tc>
-          <w:tcPr/>
-          <w:p>
-            <w:pPr>
-              <w:pStyle w:val="Compact"/>
-              <w:jc w:val="left"/>
-            </w:pPr>
-            <w:r>
-              <w:t xml:space="preserve">Two visits at different times of day, 19 to 25 October</w:t>
+              <w:t xml:space="preserve">Essential</w:t>
+            </w:r>
+          </w:p>
+        </w:tc>
+        <w:tc>
+          <w:tcPr/>
+          <w:p>
+            <w:pPr>
+              <w:pStyle w:val="Compact"/>
+              <w:jc w:val="left"/>
+            </w:pPr>
+            <w:r>
+              <w:t xml:space="preserve">One nearby business owner</w:t>
+            </w:r>
+          </w:p>
+        </w:tc>
+        <w:tc>
+          <w:tcPr/>
+          <w:p>
+            <w:pPr>
+              <w:pStyle w:val="Compact"/>
+              <w:jc w:val="left"/>
+            </w:pPr>
+            <w:r>
+              <w:t xml:space="preserve">The street’s view, and a second experience of doing business here</w:t>
             </w:r>
           </w:p>
         </w:tc>
@@ -1536,38 +1640,38 @@
               <w:jc w:val="left"/>
             </w:pPr>
             <w:r>
-              <w:t xml:space="preserve">One or two neighbours or nearby business owners</w:t>
-            </w:r>
-          </w:p>
-        </w:tc>
-        <w:tc>
-          <w:tcPr/>
-          <w:p>
-            <w:pPr>
-              <w:pStyle w:val="Compact"/>
-              <w:jc w:val="left"/>
-            </w:pPr>
-            <w:r>
-              <w:t xml:space="preserve">The street’s view of the opening and of how the area is changing</w:t>
-            </w:r>
-          </w:p>
-        </w:tc>
-        <w:tc>
-          <w:tcPr/>
-          <w:p>
-            <w:pPr>
-              <w:pStyle w:val="Compact"/>
-              <w:jc w:val="left"/>
-            </w:pPr>
-            <w:r>
-              <w:t xml:space="preserve">19 to 25 October</w:t>
+              <w:t xml:space="preserve">Only if distinct</w:t>
+            </w:r>
+          </w:p>
+        </w:tc>
+        <w:tc>
+          <w:tcPr/>
+          <w:p>
+            <w:pPr>
+              <w:pStyle w:val="Compact"/>
+              <w:jc w:val="left"/>
+            </w:pPr>
+            <w:r>
+              <w:t xml:space="preserve">A staff member, a second customer, or a resident neighbour</w:t>
+            </w:r>
+          </w:p>
+        </w:tc>
+        <w:tc>
+          <w:tcPr/>
+          <w:p>
+            <w:pPr>
+              <w:pStyle w:val="Compact"/>
+              <w:jc w:val="left"/>
+            </w:pPr>
+            <w:r>
+              <w:t xml:space="preserve">Added only where they offer a perspective the others do not</w:t>
             </w:r>
           </w:p>
         </w:tc>
       </w:tr>
     </w:tbl>
-    <w:bookmarkEnd w:id="27"/>
-    <w:bookmarkStart w:id="32" w:name="interview-questions"/>
+    <w:bookmarkEnd w:id="30"/>
+    <w:bookmarkStart w:id="34" w:name="interview-questions"/>
     <w:p>
       <w:pPr>
         <w:pStyle w:val="Heading2"/>
@@ -1581,7 +1685,7 @@
         <w:pStyle w:val="FirstParagraph"/>
       </w:pPr>
       <w:r>
-        <w:t xml:space="preserve">Each question is tagged with the research question it serves. I will also ask follow-up questions when an answer opens new ground, such as</w:t>
+        <w:t xml:space="preserve">Questions marked with a star are the core set if time is short. I will also ask follow-up questions for concrete moments, such as</w:t>
       </w:r>
       <w:r>
         <w:t xml:space="preserve"> </w:t>
@@ -1614,16 +1718,220 @@
         <w:t xml:space="preserve">”</w:t>
       </w:r>
       <w:r>
-        <w:t xml:space="preserve">, and I will record those in my notes.</w:t>
-      </w:r>
-    </w:p>
-    <w:bookmarkStart w:id="28" w:name="the-owners"/>
+        <w:t xml:space="preserve">, and record them in my notes.</w:t>
+      </w:r>
+    </w:p>
+    <w:bookmarkStart w:id="31" w:name="X98c5370b4a8c152f9ae06e34feba0290ebc2aa4"/>
     <w:p>
       <w:pPr>
         <w:pStyle w:val="Heading3"/>
       </w:pPr>
       <w:r>
-        <w:t xml:space="preserve">9.1 The owners</w:t>
+        <w:t xml:space="preserve">9.1 The owners (given to Hannah in English and Swedish on Sunday 18 October, at her request)</w:t>
+      </w:r>
+    </w:p>
+    <w:p>
+      <w:pPr>
+        <w:numPr>
+          <w:ilvl w:val="0"/>
+          <w:numId w:val="1005"/>
+        </w:numPr>
+        <w:pStyle w:val="Compact"/>
+      </w:pPr>
+      <w:r>
+        <w:t xml:space="preserve">★ Please tell me about yourselves. Who are you, and how did this restaurant begin? (RQ1)</w:t>
+      </w:r>
+    </w:p>
+    <w:p>
+      <w:pPr>
+        <w:numPr>
+          <w:ilvl w:val="0"/>
+          <w:numId w:val="1005"/>
+        </w:numPr>
+        <w:pStyle w:val="Compact"/>
+      </w:pPr>
+      <w:r>
+        <w:t xml:space="preserve">★ Why did you choose Örebro? (RQ1, RQ6)</w:t>
+      </w:r>
+    </w:p>
+    <w:p>
+      <w:pPr>
+        <w:numPr>
+          <w:ilvl w:val="0"/>
+          <w:numId w:val="1005"/>
+        </w:numPr>
+        <w:pStyle w:val="Compact"/>
+      </w:pPr>
+      <w:r>
+        <w:t xml:space="preserve">★ When did opening a restaurant here start to feel like a real possibility? (RQ1, RQ6)</w:t>
+      </w:r>
+    </w:p>
+    <w:p>
+      <w:pPr>
+        <w:numPr>
+          <w:ilvl w:val="0"/>
+          <w:numId w:val="1005"/>
+        </w:numPr>
+        <w:pStyle w:val="Compact"/>
+      </w:pPr>
+      <w:r>
+        <w:t xml:space="preserve">★ Why this street and this building? What do you know about the restaurant that was here before? (RQ1, RQ5)</w:t>
+      </w:r>
+    </w:p>
+    <w:p>
+      <w:pPr>
+        <w:numPr>
+          <w:ilvl w:val="0"/>
+          <w:numId w:val="1005"/>
+        </w:numPr>
+        <w:pStyle w:val="Compact"/>
+      </w:pPr>
+      <w:r>
+        <w:t xml:space="preserve">What do you remember about the opening day, 1 October? (RQ1)</w:t>
+      </w:r>
+    </w:p>
+    <w:p>
+      <w:pPr>
+        <w:numPr>
+          <w:ilvl w:val="0"/>
+          <w:numId w:val="1005"/>
+        </w:numPr>
+        <w:pStyle w:val="Compact"/>
+      </w:pPr>
+      <w:r>
+        <w:t xml:space="preserve">What food do you serve, and what is the story behind it? (RQ2)</w:t>
+      </w:r>
+    </w:p>
+    <w:p>
+      <w:pPr>
+        <w:numPr>
+          <w:ilvl w:val="0"/>
+          <w:numId w:val="1005"/>
+        </w:numPr>
+        <w:pStyle w:val="Compact"/>
+      </w:pPr>
+      <w:r>
+        <w:t xml:space="preserve">Do you use any ingredients from the Örebro area? Why or why not? (RQ2)</w:t>
+      </w:r>
+    </w:p>
+    <w:p>
+      <w:pPr>
+        <w:numPr>
+          <w:ilvl w:val="0"/>
+          <w:numId w:val="1005"/>
+        </w:numPr>
+        <w:pStyle w:val="Compact"/>
+      </w:pPr>
+      <w:r>
+        <w:t xml:space="preserve">★ Who comes to eat here? Is it who you expected? (RQ3)</w:t>
+      </w:r>
+    </w:p>
+    <w:p>
+      <w:pPr>
+        <w:numPr>
+          <w:ilvl w:val="0"/>
+          <w:numId w:val="1005"/>
+        </w:numPr>
+        <w:pStyle w:val="Compact"/>
+      </w:pPr>
+      <w:r>
+        <w:t xml:space="preserve">How have the neighbours welcomed you? (RQ5)</w:t>
+      </w:r>
+    </w:p>
+    <w:p>
+      <w:pPr>
+        <w:numPr>
+          <w:ilvl w:val="0"/>
+          <w:numId w:val="1005"/>
+        </w:numPr>
+        <w:pStyle w:val="Compact"/>
+      </w:pPr>
+      <w:r>
+        <w:t xml:space="preserve">★ What helped you get started? For example people, the municipality, neighbours or other businesses. (RQ4)</w:t>
+      </w:r>
+    </w:p>
+    <w:p>
+      <w:pPr>
+        <w:numPr>
+          <w:ilvl w:val="0"/>
+          <w:numId w:val="1005"/>
+        </w:numPr>
+        <w:pStyle w:val="Compact"/>
+      </w:pPr>
+      <w:r>
+        <w:t xml:space="preserve">★ What has been the biggest unexpected difficulty so far? (RQ4)</w:t>
+      </w:r>
+    </w:p>
+    <w:p>
+      <w:pPr>
+        <w:numPr>
+          <w:ilvl w:val="0"/>
+          <w:numId w:val="1005"/>
+        </w:numPr>
+        <w:pStyle w:val="Compact"/>
+      </w:pPr>
+      <w:r>
+        <w:t xml:space="preserve">What is it like to run the restaurant as a family? (RQ1)</w:t>
+      </w:r>
+    </w:p>
+    <w:p>
+      <w:pPr>
+        <w:numPr>
+          <w:ilvl w:val="0"/>
+          <w:numId w:val="1005"/>
+        </w:numPr>
+        <w:pStyle w:val="Compact"/>
+      </w:pPr>
+      <w:r>
+        <w:t xml:space="preserve">Are there local businesses, food producers or groups you would like to work with? (RQ5)</w:t>
+      </w:r>
+    </w:p>
+    <w:p>
+      <w:pPr>
+        <w:numPr>
+          <w:ilvl w:val="0"/>
+          <w:numId w:val="1005"/>
+        </w:numPr>
+        <w:pStyle w:val="Compact"/>
+      </w:pPr>
+      <w:r>
+        <w:t xml:space="preserve">★ What should someone who is new in Örebro know before they come here? (RQ6)</w:t>
+      </w:r>
+    </w:p>
+    <w:p>
+      <w:pPr>
+        <w:numPr>
+          <w:ilvl w:val="0"/>
+          <w:numId w:val="1005"/>
+        </w:numPr>
+        <w:pStyle w:val="Compact"/>
+      </w:pPr>
+      <w:r>
+        <w:t xml:space="preserve">★ Is Örebro a good place to start something new? Why or why not? (RQ6)</w:t>
+      </w:r>
+    </w:p>
+    <w:p>
+      <w:pPr>
+        <w:numPr>
+          <w:ilvl w:val="0"/>
+          <w:numId w:val="1005"/>
+        </w:numPr>
+        <w:pStyle w:val="Compact"/>
+      </w:pPr>
+      <w:r>
+        <w:t xml:space="preserve">What would you like to change or improve? (RQ4)</w:t>
+      </w:r>
+    </w:p>
+    <w:p>
+      <w:pPr>
+        <w:numPr>
+          <w:ilvl w:val="0"/>
+          <w:numId w:val="1005"/>
+        </w:numPr>
+        <w:pStyle w:val="Compact"/>
+      </w:pPr>
+      <w:r>
+        <w:t xml:space="preserve">Where do you see the restaurant one year from now? (RQ6)</w:t>
       </w:r>
     </w:p>
     <w:p>
@@ -1631,260 +1939,24 @@
         <w:pStyle w:val="FirstParagraph"/>
       </w:pPr>
       <w:r>
-        <w:t xml:space="preserve">Hannah asked to see the questions in advance, so I will give her this list on Sunday 18 October in English and Swedish.</w:t>
-      </w:r>
-    </w:p>
-    <w:p>
-      <w:pPr>
-        <w:numPr>
-          <w:ilvl w:val="0"/>
-          <w:numId w:val="1004"/>
-        </w:numPr>
-        <w:pStyle w:val="Compact"/>
-      </w:pPr>
-      <w:r>
-        <w:t xml:space="preserve">Please tell me about yourselves. Who are you, and how did this restaurant begin? (RQ1)</w:t>
-      </w:r>
-    </w:p>
-    <w:p>
-      <w:pPr>
-        <w:numPr>
-          <w:ilvl w:val="0"/>
-          <w:numId w:val="1004"/>
-        </w:numPr>
-        <w:pStyle w:val="Compact"/>
-      </w:pPr>
-      <w:r>
-        <w:t xml:space="preserve">Why did you choose Örebro? (RQ1, RQ6)</w:t>
-      </w:r>
-    </w:p>
-    <w:p>
-      <w:pPr>
-        <w:numPr>
-          <w:ilvl w:val="0"/>
-          <w:numId w:val="1004"/>
-        </w:numPr>
-        <w:pStyle w:val="Compact"/>
-      </w:pPr>
-      <w:r>
-        <w:t xml:space="preserve">Why this street and these premises? What do you know about the restaurant that was here before? (RQ1, RQ5)</w:t>
-      </w:r>
-    </w:p>
-    <w:p>
-      <w:pPr>
-        <w:numPr>
-          <w:ilvl w:val="0"/>
-          <w:numId w:val="1004"/>
-        </w:numPr>
-        <w:pStyle w:val="Compact"/>
-      </w:pPr>
-      <w:r>
-        <w:t xml:space="preserve">What do you remember about the opening day, 1 October? (RQ1)</w:t>
-      </w:r>
-    </w:p>
-    <w:p>
-      <w:pPr>
-        <w:numPr>
-          <w:ilvl w:val="0"/>
-          <w:numId w:val="1004"/>
-        </w:numPr>
-        <w:pStyle w:val="Compact"/>
-      </w:pPr>
-      <w:r>
-        <w:t xml:space="preserve">What food do you serve, and what is the story behind it? (RQ2)</w:t>
-      </w:r>
-    </w:p>
-    <w:p>
-      <w:pPr>
-        <w:numPr>
-          <w:ilvl w:val="0"/>
-          <w:numId w:val="1004"/>
-        </w:numPr>
-        <w:pStyle w:val="Compact"/>
-      </w:pPr>
-      <w:r>
-        <w:t xml:space="preserve">Do you use any ingredients from the Örebro area? Why or why not? (RQ2)</w:t>
-      </w:r>
-    </w:p>
-    <w:p>
-      <w:pPr>
-        <w:numPr>
-          <w:ilvl w:val="0"/>
-          <w:numId w:val="1004"/>
-        </w:numPr>
-        <w:pStyle w:val="Compact"/>
-      </w:pPr>
-      <w:r>
-        <w:t xml:space="preserve">What makes your restaurant special, in your own words? (RQ2)</w:t>
-      </w:r>
-    </w:p>
-    <w:p>
-      <w:pPr>
-        <w:numPr>
-          <w:ilvl w:val="0"/>
-          <w:numId w:val="1004"/>
-        </w:numPr>
-        <w:pStyle w:val="Compact"/>
-      </w:pPr>
-      <w:r>
-        <w:t xml:space="preserve">Who comes to eat here? Is that who you expected? (RQ3)</w:t>
-      </w:r>
-    </w:p>
-    <w:p>
-      <w:pPr>
-        <w:numPr>
-          <w:ilvl w:val="0"/>
-          <w:numId w:val="1004"/>
-        </w:numPr>
-        <w:pStyle w:val="Compact"/>
-      </w:pPr>
-      <w:r>
-        <w:t xml:space="preserve">From what you have seen, what do people in Örebro like when they eat out? (RQ3)</w:t>
-      </w:r>
-    </w:p>
-    <w:p>
-      <w:pPr>
-        <w:numPr>
-          <w:ilvl w:val="0"/>
-          <w:numId w:val="1004"/>
-        </w:numPr>
-        <w:pStyle w:val="Compact"/>
-      </w:pPr>
-      <w:r>
-        <w:t xml:space="preserve">What has been the hardest part of opening a restaurant in Örebro? (RQ4)</w:t>
-      </w:r>
-    </w:p>
-    <w:p>
-      <w:pPr>
-        <w:numPr>
-          <w:ilvl w:val="0"/>
-          <w:numId w:val="1004"/>
-        </w:numPr>
-        <w:pStyle w:val="Compact"/>
-      </w:pPr>
-      <w:r>
-        <w:t xml:space="preserve">Did anyone help you, for example the municipality, neighbours or other businesses? (RQ4, RQ5)</w:t>
-      </w:r>
-    </w:p>
-    <w:p>
-      <w:pPr>
-        <w:numPr>
-          <w:ilvl w:val="0"/>
-          <w:numId w:val="1004"/>
-        </w:numPr>
-        <w:pStyle w:val="Compact"/>
-      </w:pPr>
-      <w:r>
-        <w:t xml:space="preserve">Many restaurants in Sweden have closed in the last two years. How does it feel to start one now? (RQ4)</w:t>
-      </w:r>
-    </w:p>
-    <w:p>
-      <w:pPr>
-        <w:numPr>
-          <w:ilvl w:val="0"/>
-          <w:numId w:val="1004"/>
-        </w:numPr>
-        <w:pStyle w:val="Compact"/>
-      </w:pPr>
-      <w:r>
-        <w:t xml:space="preserve">How have the neighbours welcomed you? (RQ5)</w:t>
-      </w:r>
-    </w:p>
-    <w:p>
-      <w:pPr>
-        <w:numPr>
-          <w:ilvl w:val="0"/>
-          <w:numId w:val="1004"/>
-        </w:numPr>
-        <w:pStyle w:val="Compact"/>
-      </w:pPr>
-      <w:r>
-        <w:t xml:space="preserve">What is it like to run the restaurant as a family? (RQ1)</w:t>
-      </w:r>
-    </w:p>
-    <w:p>
-      <w:pPr>
-        <w:numPr>
-          <w:ilvl w:val="0"/>
-          <w:numId w:val="1004"/>
-        </w:numPr>
-        <w:pStyle w:val="Compact"/>
-      </w:pPr>
-      <w:r>
-        <w:t xml:space="preserve">What should someone who is new in Örebro know before they come here? (RQ6)</w:t>
-      </w:r>
-    </w:p>
-    <w:p>
-      <w:pPr>
-        <w:numPr>
-          <w:ilvl w:val="0"/>
-          <w:numId w:val="1004"/>
-        </w:numPr>
-        <w:pStyle w:val="Compact"/>
-      </w:pPr>
-      <w:r>
-        <w:t xml:space="preserve">Would you say Örebro is a good place to start something new? Why? (RQ6)</w:t>
-      </w:r>
-    </w:p>
-    <w:p>
-      <w:pPr>
-        <w:numPr>
-          <w:ilvl w:val="0"/>
-          <w:numId w:val="1004"/>
-        </w:numPr>
-        <w:pStyle w:val="Compact"/>
-      </w:pPr>
-      <w:r>
-        <w:t xml:space="preserve">What would you like to change or improve? (RQ4)</w:t>
-      </w:r>
-    </w:p>
-    <w:p>
-      <w:pPr>
-        <w:numPr>
-          <w:ilvl w:val="0"/>
-          <w:numId w:val="1004"/>
-        </w:numPr>
-        <w:pStyle w:val="Compact"/>
-      </w:pPr>
-      <w:r>
-        <w:t xml:space="preserve">Where do you see the restaurant one year from now? (RQ6)</w:t>
-      </w:r>
-    </w:p>
-    <w:p>
-      <w:pPr>
-        <w:numPr>
-          <w:ilvl w:val="0"/>
-          <w:numId w:val="1004"/>
-        </w:numPr>
-        <w:pStyle w:val="Compact"/>
-      </w:pPr>
-      <w:r>
-        <w:t xml:space="preserve">Are there local businesses, food producers or groups you would like to work with? (RQ5)</w:t>
-      </w:r>
-    </w:p>
-    <w:p>
-      <w:pPr>
-        <w:pStyle w:val="FirstParagraph"/>
-      </w:pPr>
-      <w:r>
-        <w:t xml:space="preserve">Practical facts I will confirm at the end: number of seats, opening hours, number of staff, price range, card or cash, booking, and menu languages.</w:t>
-      </w:r>
-    </w:p>
-    <w:bookmarkEnd w:id="28"/>
-    <w:bookmarkStart w:id="29" w:name="customers"/>
+        <w:t xml:space="preserve">Practical facts to confirm at the end: number of seats, opening hours, number of staff, price range, card or cash, booking, and menu languages.</w:t>
+      </w:r>
+    </w:p>
+    <w:bookmarkEnd w:id="31"/>
+    <w:bookmarkStart w:id="32" w:name="one-customer"/>
     <w:p>
       <w:pPr>
         <w:pStyle w:val="Heading3"/>
       </w:pPr>
       <w:r>
-        <w:t xml:space="preserve">9.2 Customers</w:t>
-      </w:r>
-    </w:p>
-    <w:p>
-      <w:pPr>
-        <w:numPr>
-          <w:ilvl w:val="0"/>
-          <w:numId w:val="1005"/>
+        <w:t xml:space="preserve">9.2 One customer</w:t>
+      </w:r>
+    </w:p>
+    <w:p>
+      <w:pPr>
+        <w:numPr>
+          <w:ilvl w:val="0"/>
+          <w:numId w:val="1006"/>
         </w:numPr>
         <w:pStyle w:val="Compact"/>
       </w:pPr>
@@ -1896,7 +1968,7 @@
       <w:pPr>
         <w:numPr>
           <w:ilvl w:val="0"/>
-          <w:numId w:val="1005"/>
+          <w:numId w:val="1006"/>
         </w:numPr>
         <w:pStyle w:val="Compact"/>
       </w:pPr>
@@ -1908,7 +1980,7 @@
       <w:pPr>
         <w:numPr>
           <w:ilvl w:val="0"/>
-          <w:numId w:val="1005"/>
+          <w:numId w:val="1006"/>
         </w:numPr>
         <w:pStyle w:val="Compact"/>
       </w:pPr>
@@ -1920,7 +1992,7 @@
       <w:pPr>
         <w:numPr>
           <w:ilvl w:val="0"/>
-          <w:numId w:val="1005"/>
+          <w:numId w:val="1006"/>
         </w:numPr>
         <w:pStyle w:val="Compact"/>
       </w:pPr>
@@ -1932,7 +2004,7 @@
       <w:pPr>
         <w:numPr>
           <w:ilvl w:val="0"/>
-          <w:numId w:val="1005"/>
+          <w:numId w:val="1006"/>
         </w:numPr>
         <w:pStyle w:val="Compact"/>
       </w:pPr>
@@ -1940,21 +2012,21 @@
         <w:t xml:space="preserve">What is one thing that could be better here? (RQ4)</w:t>
       </w:r>
     </w:p>
-    <w:bookmarkEnd w:id="29"/>
-    <w:bookmarkStart w:id="30" w:name="neighbours-and-nearby-businesses"/>
+    <w:bookmarkEnd w:id="32"/>
+    <w:bookmarkStart w:id="33" w:name="one-nearby-business-owner"/>
     <w:p>
       <w:pPr>
         <w:pStyle w:val="Heading3"/>
       </w:pPr>
       <w:r>
-        <w:t xml:space="preserve">9.3 Neighbours and nearby businesses</w:t>
-      </w:r>
-    </w:p>
-    <w:p>
-      <w:pPr>
-        <w:numPr>
-          <w:ilvl w:val="0"/>
-          <w:numId w:val="1006"/>
+        <w:t xml:space="preserve">9.3 One nearby business owner</w:t>
+      </w:r>
+    </w:p>
+    <w:p>
+      <w:pPr>
+        <w:numPr>
+          <w:ilvl w:val="0"/>
+          <w:numId w:val="1007"/>
         </w:numPr>
         <w:pStyle w:val="Compact"/>
       </w:pPr>
@@ -1966,7 +2038,7 @@
       <w:pPr>
         <w:numPr>
           <w:ilvl w:val="0"/>
-          <w:numId w:val="1006"/>
+          <w:numId w:val="1007"/>
         </w:numPr>
         <w:pStyle w:val="Compact"/>
       </w:pPr>
@@ -1978,7 +2050,7 @@
       <w:pPr>
         <w:numPr>
           <w:ilvl w:val="0"/>
-          <w:numId w:val="1006"/>
+          <w:numId w:val="1007"/>
         </w:numPr>
         <w:pStyle w:val="Compact"/>
       </w:pPr>
@@ -1990,63 +2062,17 @@
       <w:pPr>
         <w:numPr>
           <w:ilvl w:val="0"/>
-          <w:numId w:val="1006"/>
-        </w:numPr>
-        <w:pStyle w:val="Compact"/>
-      </w:pPr>
-      <w:r>
-        <w:t xml:space="preserve">Is Örebro a good place to run a business? What is hard about it? (RQ4, RQ6)</w:t>
-      </w:r>
-    </w:p>
-    <w:bookmarkEnd w:id="30"/>
-    <w:bookmarkStart w:id="31" w:name="staff-if-any"/>
-    <w:p>
-      <w:pPr>
-        <w:pStyle w:val="Heading3"/>
-      </w:pPr>
-      <w:r>
-        <w:t xml:space="preserve">9.4 Staff, if any</w:t>
-      </w:r>
-    </w:p>
-    <w:p>
-      <w:pPr>
-        <w:numPr>
-          <w:ilvl w:val="0"/>
           <w:numId w:val="1007"/>
         </w:numPr>
         <w:pStyle w:val="Compact"/>
       </w:pPr>
       <w:r>
-        <w:t xml:space="preserve">How did you come to work here? (RQ1)</w:t>
-      </w:r>
-    </w:p>
-    <w:p>
-      <w:pPr>
-        <w:numPr>
-          <w:ilvl w:val="0"/>
-          <w:numId w:val="1007"/>
-        </w:numPr>
-        <w:pStyle w:val="Compact"/>
-      </w:pPr>
-      <w:r>
-        <w:t xml:space="preserve">What do guests say most often about the place? (RQ2, RQ3)</w:t>
-      </w:r>
-    </w:p>
-    <w:p>
-      <w:pPr>
-        <w:numPr>
-          <w:ilvl w:val="0"/>
-          <w:numId w:val="1007"/>
-        </w:numPr>
-        <w:pStyle w:val="Compact"/>
-      </w:pPr>
-      <w:r>
-        <w:t xml:space="preserve">What has surprised you since the opening? (RQ4)</w:t>
-      </w:r>
-    </w:p>
-    <w:bookmarkEnd w:id="31"/>
-    <w:bookmarkEnd w:id="32"/>
-    <w:bookmarkStart w:id="33" w:name="X184dcb23b48376758129af36a1994419d371640"/>
+        <w:t xml:space="preserve">What has it been like for you to run a business here? What helped, and what was hard? (RQ4, RQ6)</w:t>
+      </w:r>
+    </w:p>
+    <w:bookmarkEnd w:id="33"/>
+    <w:bookmarkEnd w:id="34"/>
+    <w:bookmarkStart w:id="35" w:name="X184dcb23b48376758129af36a1994419d371640"/>
     <w:p>
       <w:pPr>
         <w:pStyle w:val="Heading2"/>
@@ -2104,19 +2130,19 @@
               <w:jc w:val="left"/>
             </w:pPr>
             <w:r>
-              <w:t xml:space="preserve">Other interviews</w:t>
-            </w:r>
-          </w:p>
-        </w:tc>
-        <w:tc>
-          <w:tcPr/>
-          <w:p>
-            <w:pPr>
-              <w:pStyle w:val="Compact"/>
-              <w:jc w:val="left"/>
-            </w:pPr>
-            <w:r>
-              <w:t xml:space="preserve">Desk research and observation</w:t>
+              <w:t xml:space="preserve">Customer and business owner</w:t>
+            </w:r>
+          </w:p>
+        </w:tc>
+        <w:tc>
+          <w:tcPr/>
+          <w:p>
+            <w:pPr>
+              <w:pStyle w:val="Compact"/>
+              <w:jc w:val="left"/>
+            </w:pPr>
+            <w:r>
+              <w:t xml:space="preserve">Observation and desk research</w:t>
             </w:r>
           </w:p>
         </w:tc>
@@ -2130,43 +2156,39 @@
               <w:jc w:val="left"/>
             </w:pPr>
             <w:r>
-              <w:t xml:space="preserve">RQ1 People and choice</w:t>
-            </w:r>
-          </w:p>
-        </w:tc>
-        <w:tc>
-          <w:tcPr/>
-          <w:p>
-            <w:pPr>
-              <w:pStyle w:val="Compact"/>
-              <w:jc w:val="left"/>
-            </w:pPr>
-            <w:r>
-              <w:t xml:space="preserve">1, 2, 3, 4, 14</w:t>
-            </w:r>
-          </w:p>
-        </w:tc>
-        <w:tc>
-          <w:tcPr/>
-          <w:p>
-            <w:pPr>
-              <w:pStyle w:val="Compact"/>
-              <w:jc w:val="left"/>
-            </w:pPr>
-            <w:r>
-              <w:t xml:space="preserve">Staff 1</w:t>
-            </w:r>
-          </w:p>
-        </w:tc>
-        <w:tc>
-          <w:tcPr/>
-          <w:p>
-            <w:pPr>
-              <w:pStyle w:val="Compact"/>
-              <w:jc w:val="left"/>
-            </w:pPr>
-            <w:r>
-              <w:t xml:space="preserve">Restaurant’s website and social media</w:t>
+              <w:t xml:space="preserve">RQ1 People and possibility</w:t>
+            </w:r>
+          </w:p>
+        </w:tc>
+        <w:tc>
+          <w:tcPr/>
+          <w:p>
+            <w:pPr>
+              <w:pStyle w:val="Compact"/>
+              <w:jc w:val="left"/>
+            </w:pPr>
+            <w:r>
+              <w:t xml:space="preserve">1, 2, 3, 4, 5, 12</w:t>
+            </w:r>
+          </w:p>
+        </w:tc>
+        <w:tc>
+          <w:tcPr/>
+          <w:p>
+            <w:pPr>
+              <w:pStyle w:val="Compact"/>
+            </w:pPr>
+          </w:p>
+        </w:tc>
+        <w:tc>
+          <w:tcPr/>
+          <w:p>
+            <w:pPr>
+              <w:pStyle w:val="Compact"/>
+              <w:jc w:val="left"/>
+            </w:pPr>
+            <w:r>
+              <w:t xml:space="preserve">Restaurant’s own social media</w:t>
             </w:r>
           </w:p>
         </w:tc>
@@ -2192,31 +2214,31 @@
               <w:jc w:val="left"/>
             </w:pPr>
             <w:r>
-              <w:t xml:space="preserve">5, 6, 7</w:t>
-            </w:r>
-          </w:p>
-        </w:tc>
-        <w:tc>
-          <w:tcPr/>
-          <w:p>
-            <w:pPr>
-              <w:pStyle w:val="Compact"/>
-              <w:jc w:val="left"/>
-            </w:pPr>
-            <w:r>
-              <w:t xml:space="preserve">Customers 3; staff 2</w:t>
-            </w:r>
-          </w:p>
-        </w:tc>
-        <w:tc>
-          <w:tcPr/>
-          <w:p>
-            <w:pPr>
-              <w:pStyle w:val="Compact"/>
-              <w:jc w:val="left"/>
-            </w:pPr>
-            <w:r>
-              <w:t xml:space="preserve">Menu; place story on local produce; Cajsa Warg and Grythyttan background</w:t>
+              <w:t xml:space="preserve">6, 7</w:t>
+            </w:r>
+          </w:p>
+        </w:tc>
+        <w:tc>
+          <w:tcPr/>
+          <w:p>
+            <w:pPr>
+              <w:pStyle w:val="Compact"/>
+              <w:jc w:val="left"/>
+            </w:pPr>
+            <w:r>
+              <w:t xml:space="preserve">Customer 3</w:t>
+            </w:r>
+          </w:p>
+        </w:tc>
+        <w:tc>
+          <w:tcPr/>
+          <w:p>
+            <w:pPr>
+              <w:pStyle w:val="Compact"/>
+              <w:jc w:val="left"/>
+            </w:pPr>
+            <w:r>
+              <w:t xml:space="preserve">Menu; place story on local produce</w:t>
             </w:r>
           </w:p>
         </w:tc>
@@ -2242,31 +2264,31 @@
               <w:jc w:val="left"/>
             </w:pPr>
             <w:r>
-              <w:t xml:space="preserve">8, 9</w:t>
-            </w:r>
-          </w:p>
-        </w:tc>
-        <w:tc>
-          <w:tcPr/>
-          <w:p>
-            <w:pPr>
-              <w:pStyle w:val="Compact"/>
-              <w:jc w:val="left"/>
-            </w:pPr>
-            <w:r>
-              <w:t xml:space="preserve">Customers 1, 2, 3; staff 2</w:t>
-            </w:r>
-          </w:p>
-        </w:tc>
-        <w:tc>
-          <w:tcPr/>
-          <w:p>
-            <w:pPr>
-              <w:pStyle w:val="Compact"/>
-              <w:jc w:val="left"/>
-            </w:pPr>
-            <w:r>
-              <w:t xml:space="preserve">Observation at two times of day; Statistics Sweden population data</w:t>
+              <w:t xml:space="preserve">8</w:t>
+            </w:r>
+          </w:p>
+        </w:tc>
+        <w:tc>
+          <w:tcPr/>
+          <w:p>
+            <w:pPr>
+              <w:pStyle w:val="Compact"/>
+              <w:jc w:val="left"/>
+            </w:pPr>
+            <w:r>
+              <w:t xml:space="preserve">Customer 1, 2, 3</w:t>
+            </w:r>
+          </w:p>
+        </w:tc>
+        <w:tc>
+          <w:tcPr/>
+          <w:p>
+            <w:pPr>
+              <w:pStyle w:val="Compact"/>
+              <w:jc w:val="left"/>
+            </w:pPr>
+            <w:r>
+              <w:t xml:space="preserve">Observation at two times of day</w:t>
             </w:r>
           </w:p>
         </w:tc>
@@ -2280,43 +2302,43 @@
               <w:jc w:val="left"/>
             </w:pPr>
             <w:r>
-              <w:t xml:space="preserve">RQ4 Opening a business</w:t>
-            </w:r>
-          </w:p>
-        </w:tc>
-        <w:tc>
-          <w:tcPr/>
-          <w:p>
-            <w:pPr>
-              <w:pStyle w:val="Compact"/>
-              <w:jc w:val="left"/>
-            </w:pPr>
-            <w:r>
-              <w:t xml:space="preserve">10, 11, 12, 17</w:t>
-            </w:r>
-          </w:p>
-        </w:tc>
-        <w:tc>
-          <w:tcPr/>
-          <w:p>
-            <w:pPr>
-              <w:pStyle w:val="Compact"/>
-              <w:jc w:val="left"/>
-            </w:pPr>
-            <w:r>
-              <w:t xml:space="preserve">Customers 5; neighbours 4; staff 3</w:t>
-            </w:r>
-          </w:p>
-        </w:tc>
-        <w:tc>
-          <w:tcPr/>
-          <w:p>
-            <w:pPr>
-              <w:pStyle w:val="Compact"/>
-              <w:jc w:val="left"/>
-            </w:pPr>
-            <w:r>
-              <w:t xml:space="preserve">Visita 2025 report; Ekonomifakta business statistics</w:t>
+              <w:t xml:space="preserve">RQ4 Starting a business</w:t>
+            </w:r>
+          </w:p>
+        </w:tc>
+        <w:tc>
+          <w:tcPr/>
+          <w:p>
+            <w:pPr>
+              <w:pStyle w:val="Compact"/>
+              <w:jc w:val="left"/>
+            </w:pPr>
+            <w:r>
+              <w:t xml:space="preserve">10, 11, 16</w:t>
+            </w:r>
+          </w:p>
+        </w:tc>
+        <w:tc>
+          <w:tcPr/>
+          <w:p>
+            <w:pPr>
+              <w:pStyle w:val="Compact"/>
+              <w:jc w:val="left"/>
+            </w:pPr>
+            <w:r>
+              <w:t xml:space="preserve">Customer 5; business owner 4</w:t>
+            </w:r>
+          </w:p>
+        </w:tc>
+        <w:tc>
+          <w:tcPr/>
+          <w:p>
+            <w:pPr>
+              <w:pStyle w:val="Compact"/>
+              <w:jc w:val="left"/>
+            </w:pPr>
+            <w:r>
+              <w:t xml:space="preserve">National and municipal context, clearly labelled</w:t>
             </w:r>
           </w:p>
         </w:tc>
@@ -2330,43 +2352,43 @@
               <w:jc w:val="left"/>
             </w:pPr>
             <w:r>
-              <w:t xml:space="preserve">RQ5 Street and neighbourhood</w:t>
-            </w:r>
-          </w:p>
-        </w:tc>
-        <w:tc>
-          <w:tcPr/>
-          <w:p>
-            <w:pPr>
-              <w:pStyle w:val="Compact"/>
-              <w:jc w:val="left"/>
-            </w:pPr>
-            <w:r>
-              <w:t xml:space="preserve">3, 11, 13, 19</w:t>
-            </w:r>
-          </w:p>
-        </w:tc>
-        <w:tc>
-          <w:tcPr/>
-          <w:p>
-            <w:pPr>
-              <w:pStyle w:val="Compact"/>
-              <w:jc w:val="left"/>
-            </w:pPr>
-            <w:r>
-              <w:t xml:space="preserve">Customers 2, 4; neighbours 1, 2, 3</w:t>
-            </w:r>
-          </w:p>
-        </w:tc>
-        <w:tc>
-          <w:tcPr/>
-          <w:p>
-            <w:pPr>
-              <w:pStyle w:val="Compact"/>
-              <w:jc w:val="left"/>
-            </w:pPr>
-            <w:r>
-              <w:t xml:space="preserve">Observation of the street; what the premises were before</w:t>
+              <w:t xml:space="preserve">RQ5 Street and neighbours</w:t>
+            </w:r>
+          </w:p>
+        </w:tc>
+        <w:tc>
+          <w:tcPr/>
+          <w:p>
+            <w:pPr>
+              <w:pStyle w:val="Compact"/>
+              <w:jc w:val="left"/>
+            </w:pPr>
+            <w:r>
+              <w:t xml:space="preserve">4, 9, 13</w:t>
+            </w:r>
+          </w:p>
+        </w:tc>
+        <w:tc>
+          <w:tcPr/>
+          <w:p>
+            <w:pPr>
+              <w:pStyle w:val="Compact"/>
+              <w:jc w:val="left"/>
+            </w:pPr>
+            <w:r>
+              <w:t xml:space="preserve">Customer 2, 4; business owner 1, 2, 3</w:t>
+            </w:r>
+          </w:p>
+        </w:tc>
+        <w:tc>
+          <w:tcPr/>
+          <w:p>
+            <w:pPr>
+              <w:pStyle w:val="Compact"/>
+              <w:jc w:val="left"/>
+            </w:pPr>
+            <w:r>
+              <w:t xml:space="preserve">Observation of the street</w:t>
             </w:r>
           </w:p>
         </w:tc>
@@ -2392,38 +2414,38 @@
               <w:jc w:val="left"/>
             </w:pPr>
             <w:r>
-              <w:t xml:space="preserve">2, 15, 16, 18</w:t>
-            </w:r>
-          </w:p>
-        </w:tc>
-        <w:tc>
-          <w:tcPr/>
-          <w:p>
-            <w:pPr>
-              <w:pStyle w:val="Compact"/>
-              <w:jc w:val="left"/>
-            </w:pPr>
-            <w:r>
-              <w:t xml:space="preserve">Customers 4; neighbours 4</w:t>
-            </w:r>
-          </w:p>
-        </w:tc>
-        <w:tc>
-          <w:tcPr/>
-          <w:p>
-            <w:pPr>
-              <w:pStyle w:val="Compact"/>
-              <w:jc w:val="left"/>
-            </w:pPr>
-            <w:r>
-              <w:t xml:space="preserve">Örebro place story; Örebro University exchange-student figures</w:t>
+              <w:t xml:space="preserve">2, 3, 14, 15, 17</w:t>
+            </w:r>
+          </w:p>
+        </w:tc>
+        <w:tc>
+          <w:tcPr/>
+          <w:p>
+            <w:pPr>
+              <w:pStyle w:val="Compact"/>
+              <w:jc w:val="left"/>
+            </w:pPr>
+            <w:r>
+              <w:t xml:space="preserve">Customer 4; business owner 4</w:t>
+            </w:r>
+          </w:p>
+        </w:tc>
+        <w:tc>
+          <w:tcPr/>
+          <w:p>
+            <w:pPr>
+              <w:pStyle w:val="Compact"/>
+              <w:jc w:val="left"/>
+            </w:pPr>
+            <w:r>
+              <w:t xml:space="preserve">Place story; population and student figures</w:t>
             </w:r>
           </w:p>
         </w:tc>
       </w:tr>
     </w:tbl>
-    <w:bookmarkEnd w:id="33"/>
-    <w:bookmarkStart w:id="34" w:name="method-and-ethics"/>
+    <w:bookmarkEnd w:id="35"/>
+    <w:bookmarkStart w:id="36" w:name="method-and-ethics"/>
     <w:p>
       <w:pPr>
         <w:pStyle w:val="Heading2"/>
@@ -2451,7 +2473,7 @@
         <w:t xml:space="preserve"> </w:t>
       </w:r>
       <w:r>
-        <w:t xml:space="preserve">I will explain that the interview is for a course project, ask permission to record, and ask how each person wants to be named: full name, first name only, or role only.</w:t>
+        <w:t xml:space="preserve">I will explain that the interview is for a course project, ask permission to record and to photograph, and ask how each person wants to be named.</w:t>
       </w:r>
     </w:p>
     <w:p>
@@ -2467,13 +2489,13 @@
           <w:bCs/>
           <w:b/>
         </w:rPr>
-        <w:t xml:space="preserve">Language.</w:t>
-      </w:r>
-      <w:r>
-        <w:t xml:space="preserve"> </w:t>
-      </w:r>
-      <w:r>
-        <w:t xml:space="preserve">Hannah can answer in Swedish or the language she prefers. I will record, have the answers translated, and have a Swedish speaker check my translations. Any quotation I translate will be marked as translated.</w:t>
+        <w:t xml:space="preserve">Language and translation.</w:t>
+      </w:r>
+      <w:r>
+        <w:t xml:space="preserve"> </w:t>
+      </w:r>
+      <w:r>
+        <w:t xml:space="preserve">Hannah can answer in Swedish. I will record the interview and translate the answers. A Swedish speaker will check the translations, and I will check facts and translations as I write rather than leaving it all to the end. Translated quotations will be marked as translated and will preserve the speaker’s meaning. Where a word is uncertain, I will say so or paraphrase rather than quote.</w:t>
       </w:r>
     </w:p>
     <w:p>
@@ -2495,7 +2517,7 @@
         <w:t xml:space="preserve"> </w:t>
       </w:r>
       <w:r>
-        <w:t xml:space="preserve">Every quotation goes into a verification log with a timestamp before I use it. Every fact is logged with its source.</w:t>
+        <w:t xml:space="preserve">Every quotation goes into a verification log with a timestamp before I use it. Every fact is logged with its source, date and geographical scope.</w:t>
       </w:r>
     </w:p>
     <w:p>
@@ -2517,33 +2539,11 @@
         <w:t xml:space="preserve"> </w:t>
       </w:r>
       <w:r>
-        <w:t xml:space="preserve">The feature will include at least one perspective besides the owners’ and at least one thing that could be better.</w:t>
-      </w:r>
-    </w:p>
-    <w:p>
-      <w:pPr>
-        <w:numPr>
-          <w:ilvl w:val="0"/>
-          <w:numId w:val="1008"/>
-        </w:numPr>
-        <w:pStyle w:val="Compact"/>
-      </w:pPr>
-      <w:r>
-        <w:rPr>
-          <w:bCs/>
-          <w:b/>
-        </w:rPr>
-        <w:t xml:space="preserve">Photographs.</w:t>
-      </w:r>
-      <w:r>
-        <w:t xml:space="preserve"> </w:t>
-      </w:r>
-      <w:r>
-        <w:t xml:space="preserve">I will photograph only with permission, and I will not present posed people as real customers.</w:t>
-      </w:r>
-    </w:p>
-    <w:bookmarkEnd w:id="34"/>
-    <w:bookmarkStart w:id="35" w:name="timeline"/>
+        <w:t xml:space="preserve">The feature includes a customer’s and a nearby business owner’s view, and at least one thing that could be better.</w:t>
+      </w:r>
+    </w:p>
+    <w:bookmarkEnd w:id="36"/>
+    <w:bookmarkStart w:id="37" w:name="timeline"/>
     <w:p>
       <w:pPr>
         <w:pStyle w:val="Heading2"/>
@@ -2601,19 +2601,19 @@
               <w:jc w:val="left"/>
             </w:pPr>
             <w:r>
-              <w:t xml:space="preserve">Thursday 15 October</w:t>
-            </w:r>
-          </w:p>
-        </w:tc>
-        <w:tc>
-          <w:tcPr/>
-          <w:p>
-            <w:pPr>
-              <w:pStyle w:val="Compact"/>
-              <w:jc w:val="left"/>
-            </w:pPr>
-            <w:r>
-              <w:t xml:space="preserve">Send this plan and the questions</w:t>
+              <w:t xml:space="preserve">Sunday 18 October</w:t>
+            </w:r>
+          </w:p>
+        </w:tc>
+        <w:tc>
+          <w:tcPr/>
+          <w:p>
+            <w:pPr>
+              <w:pStyle w:val="Compact"/>
+              <w:jc w:val="left"/>
+            </w:pPr>
+            <w:r>
+              <w:t xml:space="preserve">Give Hannah the questions in English and Swedish</w:t>
             </w:r>
           </w:p>
         </w:tc>
@@ -2627,19 +2627,19 @@
               <w:jc w:val="left"/>
             </w:pPr>
             <w:r>
-              <w:t xml:space="preserve">Sunday 18 October</w:t>
-            </w:r>
-          </w:p>
-        </w:tc>
-        <w:tc>
-          <w:tcPr/>
-          <w:p>
-            <w:pPr>
-              <w:pStyle w:val="Compact"/>
-              <w:jc w:val="left"/>
-            </w:pPr>
-            <w:r>
-              <w:t xml:space="preserve">Give Hannah the owner questions in English and Swedish</w:t>
+              <w:t xml:space="preserve">19 to 21 October</w:t>
+            </w:r>
+          </w:p>
+        </w:tc>
+        <w:tc>
+          <w:tcPr/>
+          <w:p>
+            <w:pPr>
+              <w:pStyle w:val="Compact"/>
+              <w:jc w:val="left"/>
+            </w:pPr>
+            <w:r>
+              <w:t xml:space="preserve">Interviews and first visits; transcribe and translate the same day; begin writing</w:t>
             </w:r>
           </w:p>
         </w:tc>
@@ -2653,19 +2653,19 @@
               <w:jc w:val="left"/>
             </w:pPr>
             <w:r>
-              <w:t xml:space="preserve">Monday 19 October</w:t>
-            </w:r>
-          </w:p>
-        </w:tc>
-        <w:tc>
-          <w:tcPr/>
-          <w:p>
-            <w:pPr>
-              <w:pStyle w:val="Compact"/>
-              <w:jc w:val="left"/>
-            </w:pPr>
-            <w:r>
-              <w:t xml:space="preserve">Interview the owners; first observation visit</w:t>
+              <w:t xml:space="preserve">22 to 25 October</w:t>
+            </w:r>
+          </w:p>
+        </w:tc>
+        <w:tc>
+          <w:tcPr/>
+          <w:p>
+            <w:pPr>
+              <w:pStyle w:val="Compact"/>
+              <w:jc w:val="left"/>
+            </w:pPr>
+            <w:r>
+              <w:t xml:space="preserve">First draft of the feature, checking facts and translations while writing</w:t>
             </w:r>
           </w:p>
         </w:tc>
@@ -2679,19 +2679,19 @@
               <w:jc w:val="left"/>
             </w:pPr>
             <w:r>
-              <w:t xml:space="preserve">19 to 25 October</w:t>
-            </w:r>
-          </w:p>
-        </w:tc>
-        <w:tc>
-          <w:tcPr/>
-          <w:p>
-            <w:pPr>
-              <w:pStyle w:val="Compact"/>
-              <w:jc w:val="left"/>
-            </w:pPr>
-            <w:r>
-              <w:t xml:space="preserve">Customer, neighbour and staff interviews; second visit at a different time</w:t>
+              <w:t xml:space="preserve">26 to 30 October</w:t>
+            </w:r>
+          </w:p>
+        </w:tc>
+        <w:tc>
+          <w:tcPr/>
+          <w:p>
+            <w:pPr>
+              <w:pStyle w:val="Compact"/>
+              <w:jc w:val="left"/>
+            </w:pPr>
+            <w:r>
+              <w:t xml:space="preserve">Further photographs; the three social media posts; the theoretical brief</w:t>
             </w:r>
           </w:p>
         </w:tc>
@@ -2705,19 +2705,19 @@
               <w:jc w:val="left"/>
             </w:pPr>
             <w:r>
-              <w:t xml:space="preserve">26 to 29 October</w:t>
-            </w:r>
-          </w:p>
-        </w:tc>
-        <w:tc>
-          <w:tcPr/>
-          <w:p>
-            <w:pPr>
-              <w:pStyle w:val="Compact"/>
-              <w:jc w:val="left"/>
-            </w:pPr>
-            <w:r>
-              <w:t xml:space="preserve">Write the four texts and the communication plan</w:t>
+              <w:t xml:space="preserve">31 October to 1 November</w:t>
+            </w:r>
+          </w:p>
+        </w:tc>
+        <w:tc>
+          <w:tcPr/>
+          <w:p>
+            <w:pPr>
+              <w:pStyle w:val="Compact"/>
+              <w:jc w:val="left"/>
+            </w:pPr>
+            <w:r>
+              <w:t xml:space="preserve">Final check of facts and quotations; edit; submit</w:t>
             </w:r>
           </w:p>
         </w:tc>
@@ -2731,32 +2731,6 @@
               <w:jc w:val="left"/>
             </w:pPr>
             <w:r>
-              <w:t xml:space="preserve">30 October to 1 November</w:t>
-            </w:r>
-          </w:p>
-        </w:tc>
-        <w:tc>
-          <w:tcPr/>
-          <w:p>
-            <w:pPr>
-              <w:pStyle w:val="Compact"/>
-              <w:jc w:val="left"/>
-            </w:pPr>
-            <w:r>
-              <w:t xml:space="preserve">Check facts and quotations, edit, and submit</w:t>
-            </w:r>
-          </w:p>
-        </w:tc>
-      </w:tr>
-      <w:tr>
-        <w:tc>
-          <w:tcPr/>
-          <w:p>
-            <w:pPr>
-              <w:pStyle w:val="Compact"/>
-              <w:jc w:val="left"/>
-            </w:pPr>
-            <w:r>
               <w:t xml:space="preserve">2 November</w:t>
             </w:r>
           </w:p>
@@ -2775,8 +2749,8 @@
         </w:tc>
       </w:tr>
     </w:tbl>
-    <w:bookmarkEnd w:id="35"/>
-    <w:bookmarkStart w:id="36" w:name="references"/>
+    <w:bookmarkEnd w:id="37"/>
+    <w:bookmarkStart w:id="38" w:name="references"/>
     <w:p>
       <w:pPr>
         <w:pStyle w:val="Heading2"/>
@@ -2880,6 +2854,30 @@
         <w:pStyle w:val="BodyText"/>
       </w:pPr>
       <w:r>
+        <w:t xml:space="preserve">Region Örebro län. (2023, November 8).</w:t>
+      </w:r>
+      <w:r>
+        <w:t xml:space="preserve"> </w:t>
+      </w:r>
+      <w:r>
+        <w:rPr>
+          <w:iCs/>
+          <w:i/>
+        </w:rPr>
+        <w:t xml:space="preserve">Platsberättelse Örebro län: Workshop</w:t>
+      </w:r>
+      <w:r>
+        <w:t xml:space="preserve"> </w:t>
+      </w:r>
+      <w:r>
+        <w:t xml:space="preserve">[Presentation by Placebrander]. https://orta.regionorebrolan.se/contentassets/996289e208b14b398ae838d7ead0cf86/presentation-platsberattelse-231108.pdf</w:t>
+      </w:r>
+    </w:p>
+    <w:p>
+      <w:pPr>
+        <w:pStyle w:val="BodyText"/>
+      </w:pPr>
+      <w:r>
         <w:t xml:space="preserve">Region Örebro län. (2024).</w:t>
       </w:r>
       <w:r>
@@ -2904,6 +2902,30 @@
         <w:pStyle w:val="BodyText"/>
       </w:pPr>
       <w:r>
+        <w:t xml:space="preserve">Realtid. (2026, January 5).</w:t>
+      </w:r>
+      <w:r>
+        <w:t xml:space="preserve"> </w:t>
+      </w:r>
+      <w:r>
+        <w:rPr>
+          <w:iCs/>
+          <w:i/>
+        </w:rPr>
+        <w:t xml:space="preserve">Konkurserna rasar för hotell och restauranger</w:t>
+      </w:r>
+      <w:r>
+        <w:t xml:space="preserve"> </w:t>
+      </w:r>
+      <w:r>
+        <w:t xml:space="preserve">[Bankruptcies plunge for hotels and restaurants; UC data]. https://www.realtid.se/bors-finans/konkurserna-rasar-for-hotell-och-restauranger/</w:t>
+      </w:r>
+    </w:p>
+    <w:p>
+      <w:pPr>
+        <w:pStyle w:val="BodyText"/>
+      </w:pPr>
+      <w:r>
         <w:t xml:space="preserve">Sjöberg, M. (n.d.). Anna Christina (Cajsa) Warg (A. Grosjean, Trans.). In</w:t>
       </w:r>
       <w:r>
@@ -2949,6 +2971,27 @@
         <w:pStyle w:val="BodyText"/>
       </w:pPr>
       <w:r>
+        <w:t xml:space="preserve">Svenskt Näringsliv. (2026).</w:t>
+      </w:r>
+      <w:r>
+        <w:t xml:space="preserve"> </w:t>
+      </w:r>
+      <w:r>
+        <w:rPr>
+          <w:iCs/>
+          <w:i/>
+        </w:rPr>
+        <w:t xml:space="preserve">Företagsklimat: Örebro</w:t>
+      </w:r>
+      <w:r>
+        <w:t xml:space="preserve">. https://www.foretagsklimat.se/orebro</w:t>
+      </w:r>
+    </w:p>
+    <w:p>
+      <w:pPr>
+        <w:pStyle w:val="BodyText"/>
+      </w:pPr>
+      <w:r>
         <w:t xml:space="preserve">Visita. (2026).</w:t>
       </w:r>
       <w:r>
@@ -2968,7 +3011,7 @@
         <w:t xml:space="preserve">[Annual report 2025]. https://visita.se/app/uploads/2026/04/Visita-Versamhetsberattelse-2025.pdf</w:t>
       </w:r>
     </w:p>
-    <w:bookmarkEnd w:id="36"/>
+    <w:bookmarkEnd w:id="38"/>
     <w:sectPr/>
   </w:body>
 </w:document>
@@ -3249,34 +3292,7 @@
     <w:abstractNumId w:val="991"/>
   </w:num>
   <w:num w:numId="1004">
-    <w:abstractNumId w:val="99411"/>
-    <w:lvlOverride w:ilvl="0">
-      <w:startOverride w:val="1"/>
-    </w:lvlOverride>
-    <w:lvlOverride w:ilvl="1">
-      <w:startOverride w:val="1"/>
-    </w:lvlOverride>
-    <w:lvlOverride w:ilvl="2">
-      <w:startOverride w:val="1"/>
-    </w:lvlOverride>
-    <w:lvlOverride w:ilvl="3">
-      <w:startOverride w:val="1"/>
-    </w:lvlOverride>
-    <w:lvlOverride w:ilvl="4">
-      <w:startOverride w:val="1"/>
-    </w:lvlOverride>
-    <w:lvlOverride w:ilvl="5">
-      <w:startOverride w:val="1"/>
-    </w:lvlOverride>
-    <w:lvlOverride w:ilvl="6">
-      <w:startOverride w:val="1"/>
-    </w:lvlOverride>
-    <w:lvlOverride w:ilvl="7">
-      <w:startOverride w:val="1"/>
-    </w:lvlOverride>
-    <w:lvlOverride w:ilvl="8">
-      <w:startOverride w:val="1"/>
-    </w:lvlOverride>
+    <w:abstractNumId w:val="991"/>
   </w:num>
   <w:num w:numId="1005">
     <w:abstractNumId w:val="99411"/>

</xml_diff>

<commit_message>
Drop the placeholder owner name "Hannah"
The owner's name was only an assumption. Refer to the owners as a wife
and husband, greet both on the question sheet without a name, rename it
to 09_Questions_for_Owners, and address both owners in the Swedish text.

Co-Authored-By: Claude Opus 5.5 <noreply@anthropic.com>
Claude-Session: https://claude.ai/code/session_018MUZWYbwBKJGQrLkujpwGT
</commit_message>
<xml_diff>
--- a/place-branding/08_Plan_and_Questions_for_Lecturer.docx
+++ b/place-branding/08_Plan_and_Questions_for_Lecturer.docx
@@ -478,7 +478,7 @@
         <w:t xml:space="preserve"> </w:t>
       </w:r>
       <w:r>
-        <w:t xml:space="preserve">Hannah and her husband own and run it together, which gives the feature a human centre.</w:t>
+        <w:t xml:space="preserve">A wife and husband own and run it together, which gives the feature a human centre.</w:t>
       </w:r>
     </w:p>
     <w:p>
@@ -1294,7 +1294,7 @@
         <w:t xml:space="preserve"> </w:t>
       </w:r>
       <w:r>
-        <w:t xml:space="preserve">Hannah is more comfortable in Swedish than English. I will handle this as described in section 11.</w:t>
+        <w:t xml:space="preserve">The wife is more comfortable in Swedish than English. I will handle this as described in section 11.</w:t>
       </w:r>
     </w:p>
     <w:bookmarkEnd w:id="28"/>
@@ -1538,7 +1538,7 @@
               <w:jc w:val="left"/>
             </w:pPr>
             <w:r>
-              <w:t xml:space="preserve">Hannah and her husband, the owners</w:t>
+              <w:t xml:space="preserve">The owners, a wife and husband</w:t>
             </w:r>
           </w:p>
         </w:tc>
@@ -1721,13 +1721,13 @@
         <w:t xml:space="preserve">, and record them in my notes.</w:t>
       </w:r>
     </w:p>
-    <w:bookmarkStart w:id="31" w:name="X98c5370b4a8c152f9ae06e34feba0290ebc2aa4"/>
+    <w:bookmarkStart w:id="31" w:name="Xc3e96c0d135cb147b84fe6f2a00e122639f2995"/>
     <w:p>
       <w:pPr>
         <w:pStyle w:val="Heading3"/>
       </w:pPr>
       <w:r>
-        <w:t xml:space="preserve">9.1 The owners (given to Hannah in English and Swedish on Sunday 18 October, at her request)</w:t>
+        <w:t xml:space="preserve">9.1 The owners (given to the owners in English and Swedish on Sunday 18 October, at the wife’s request)</w:t>
       </w:r>
     </w:p>
     <w:p>
@@ -2495,7 +2495,7 @@
         <w:t xml:space="preserve"> </w:t>
       </w:r>
       <w:r>
-        <w:t xml:space="preserve">Hannah can answer in Swedish. I will record the interview and translate the answers. A Swedish speaker will check the translations, and I will check facts and translations as I write rather than leaving it all to the end. Translated quotations will be marked as translated and will preserve the speaker’s meaning. Where a word is uncertain, I will say so or paraphrase rather than quote.</w:t>
+        <w:t xml:space="preserve">The owners can answer in Swedish. I will record the interview and translate the answers. A Swedish speaker will check the translations, and I will check facts and translations as I write rather than leaving it all to the end. Translated quotations will be marked as translated and will preserve the speaker’s meaning. Where a word is uncertain, I will say so or paraphrase rather than quote.</w:t>
       </w:r>
     </w:p>
     <w:p>
@@ -2613,7 +2613,7 @@
               <w:jc w:val="left"/>
             </w:pPr>
             <w:r>
-              <w:t xml:space="preserve">Give Hannah the questions in English and Swedish</w:t>
+              <w:t xml:space="preserve">Give the owners the questions in English and Swedish</w:t>
             </w:r>
           </w:p>
         </w:tc>

</xml_diff>

<commit_message>
Add an opening-hours question for the owners
The restaurant opens only in the evening. Ask why they chose evenings
over breakfast or lunch, in English and Swedish, as owner question 12,
tagged to RQ3 and RQ4, and renumber the rest of the list and the
research-question table.

Co-Authored-By: Claude Opus 5.5 <noreply@anthropic.com>
Claude-Session: https://claude.ai/code/session_018MUZWYbwBKJGQrLkujpwGT
</commit_message>
<xml_diff>
--- a/place-branding/08_Plan_and_Questions_for_Lecturer.docx
+++ b/place-branding/08_Plan_and_Questions_for_Lecturer.docx
@@ -1871,6 +1871,18 @@
         <w:pStyle w:val="Compact"/>
       </w:pPr>
       <w:r>
+        <w:t xml:space="preserve">Why did you choose to open in the evenings rather than for breakfast or lunch? (RQ3, RQ4)</w:t>
+      </w:r>
+    </w:p>
+    <w:p>
+      <w:pPr>
+        <w:numPr>
+          <w:ilvl w:val="0"/>
+          <w:numId w:val="1005"/>
+        </w:numPr>
+        <w:pStyle w:val="Compact"/>
+      </w:pPr>
+      <w:r>
         <w:t xml:space="preserve">What is it like to run the restaurant as a family? (RQ1)</w:t>
       </w:r>
     </w:p>
@@ -2168,7 +2180,7 @@
               <w:jc w:val="left"/>
             </w:pPr>
             <w:r>
-              <w:t xml:space="preserve">1, 2, 3, 4, 5, 12</w:t>
+              <w:t xml:space="preserve">1, 2, 3, 4, 5, 13</w:t>
             </w:r>
           </w:p>
         </w:tc>
@@ -2264,7 +2276,7 @@
               <w:jc w:val="left"/>
             </w:pPr>
             <w:r>
-              <w:t xml:space="preserve">8</w:t>
+              <w:t xml:space="preserve">8, 12</w:t>
             </w:r>
           </w:p>
         </w:tc>
@@ -2314,7 +2326,7 @@
               <w:jc w:val="left"/>
             </w:pPr>
             <w:r>
-              <w:t xml:space="preserve">10, 11, 16</w:t>
+              <w:t xml:space="preserve">10, 11, 12, 17</w:t>
             </w:r>
           </w:p>
         </w:tc>
@@ -2364,7 +2376,7 @@
               <w:jc w:val="left"/>
             </w:pPr>
             <w:r>
-              <w:t xml:space="preserve">4, 9, 13</w:t>
+              <w:t xml:space="preserve">4, 9, 14</w:t>
             </w:r>
           </w:p>
         </w:tc>
@@ -2414,7 +2426,7 @@
               <w:jc w:val="left"/>
             </w:pPr>
             <w:r>
-              <w:t xml:space="preserve">2, 3, 14, 15, 17</w:t>
+              <w:t xml:space="preserve">2, 3, 15, 16, 18</w:t>
             </w:r>
           </w:p>
         </w:tc>

</xml_diff>

<commit_message>
Make the owners' question sheet English-only
The student chose to give the owners the questions in English only.
Remove the Swedish lines from the sheet and update the plan, README and
feedback notes to match. Owners can still answer in Swedish at the
interview.

Co-Authored-By: Claude Opus 5.5 <noreply@anthropic.com>
Claude-Session: https://claude.ai/code/session_018MUZWYbwBKJGQrLkujpwGT
</commit_message>
<xml_diff>
--- a/place-branding/08_Plan_and_Questions_for_Lecturer.docx
+++ b/place-branding/08_Plan_and_Questions_for_Lecturer.docx
@@ -1721,13 +1721,13 @@
         <w:t xml:space="preserve">, and record them in my notes.</w:t>
       </w:r>
     </w:p>
-    <w:bookmarkStart w:id="31" w:name="Xc3e96c0d135cb147b84fe6f2a00e122639f2995"/>
+    <w:bookmarkStart w:id="31" w:name="Xd8f50ab235f17fa942f4c0f3e5bb08bd836c31f"/>
     <w:p>
       <w:pPr>
         <w:pStyle w:val="Heading3"/>
       </w:pPr>
       <w:r>
-        <w:t xml:space="preserve">9.1 The owners (given to the owners in English and Swedish on Sunday 18 October, at the wife’s request)</w:t>
+        <w:t xml:space="preserve">9.1 The owners (given to the owners in English on Sunday 18 October, at the wife’s request)</w:t>
       </w:r>
     </w:p>
     <w:p>
@@ -2625,7 +2625,7 @@
               <w:jc w:val="left"/>
             </w:pPr>
             <w:r>
-              <w:t xml:space="preserve">Give the owners the questions in English and Swedish</w:t>
+              <w:t xml:space="preserve">Give the owners the questions in English</w:t>
             </w:r>
           </w:p>
         </w:tc>

</xml_diff>